<commit_message>
docs(templates): complete AI disclosure and privacy forms
</commit_message>
<xml_diff>
--- a/AI Templates/[AI-03] - FIT@HCMUS - AI Disclosure Form_En.docx
+++ b/AI Templates/[AI-03] - FIT@HCMUS - AI Disclosure Form_En.docx
@@ -410,302 +410,2229 @@
       </w:r>
     </w:p>
     <w:p>
+      <w:pPr>
+        <w:rPr>
+          <w:lang w:val="vi-VN"/>
+        </w:rPr>
+      </w:pPr>
       <w:r>
         <w:rPr>
           <w:rFonts w:ascii="Arial" w:hAnsi="Arial"/>
-          <w:i/>
-          <w:color w:val="707070"/>
-          <w:sz w:val="20"/>
-        </w:rPr>
-        <w:t>List every AI tool used for this assignment (e.g., AI Tool (e.g., ChatGPT, Claude, Gemini), ChatGPT, GitHub Copilot, Cursor, Gemini).</w:t>
-      </w:r>
-    </w:p>
-    <w:p>
+        </w:rPr>
+        <w:t>Gemini</w:t>
+      </w:r>
       <w:r>
         <w:rPr>
           <w:rFonts w:ascii="Arial" w:hAnsi="Arial"/>
-        </w:rPr>
-        <w:t>__________________________________________________________________________________________</w:t>
-      </w:r>
-    </w:p>
-    <w:p>
+          <w:lang w:val="vi-VN"/>
+        </w:rPr>
+        <w:t>, ChatGPT, GitHub Copilot, Antigravity IDE.</w:t>
+      </w:r>
+    </w:p>
+    <w:p>
+      <w:pPr>
+        <w:pStyle w:val="Heading3"/>
+      </w:pPr>
       <w:r>
         <w:rPr>
           <w:rFonts w:ascii="Arial" w:hAnsi="Arial"/>
         </w:rPr>
-        <w:t>__________________________________________________________________________________________</w:t>
-      </w:r>
-    </w:p>
-    <w:p>
+        <w:t>2. Stage(s) of the assignment where AI was used:</w:t>
+      </w:r>
+    </w:p>
+    <w:p>
+      <w:pPr>
+        <w:rPr>
+          <w:lang w:val="vi-VN"/>
+        </w:rPr>
+      </w:pPr>
+      <w:r>
+        <w:t>AI was used for brainstorming, outlining, drafting,</w:t>
+      </w:r>
+      <w:r>
+        <w:rPr>
+          <w:lang w:val="vi-VN"/>
+        </w:rPr>
+        <w:t xml:space="preserve"> </w:t>
+      </w:r>
+      <w:proofErr w:type="gramStart"/>
+      <w:r>
+        <w:rPr>
+          <w:lang w:val="vi-VN"/>
+        </w:rPr>
+        <w:t xml:space="preserve">feedback,  coding, </w:t>
+      </w:r>
+      <w:r>
+        <w:t xml:space="preserve"> visual</w:t>
+      </w:r>
+      <w:proofErr w:type="gramEnd"/>
+      <w:r>
+        <w:t xml:space="preserve"> design, and test case generation.</w:t>
+      </w:r>
+    </w:p>
+    <w:p>
+      <w:pPr>
+        <w:pStyle w:val="Heading3"/>
+      </w:pPr>
       <w:r>
         <w:rPr>
           <w:rFonts w:ascii="Arial" w:hAnsi="Arial"/>
         </w:rPr>
-        <w:t>__________________________________________________________________________________________</w:t>
+        <w:t>3. Main prompts or tasks given to the AI:</w:t>
+      </w:r>
+    </w:p>
+    <w:p>
+      <w:pPr>
+        <w:rPr>
+          <w:lang w:val="vi-VN"/>
+        </w:rPr>
+      </w:pPr>
+    </w:p>
+    <w:p>
+      <w:pPr>
+        <w:pStyle w:val="ListParagraph"/>
+        <w:numPr>
+          <w:ilvl w:val="0"/>
+          <w:numId w:val="14"/>
+        </w:numPr>
+        <w:rPr>
+          <w:lang w:val="vi-VN"/>
+        </w:rPr>
+      </w:pPr>
+      <w:r>
+        <w:rPr>
+          <w:lang w:val="vi-VN"/>
+        </w:rPr>
+        <w:t>Prompt 1:</w:t>
+      </w:r>
+    </w:p>
+    <w:p>
+      <w:pPr>
+        <w:rPr>
+          <w:lang w:val="vi-VN"/>
+        </w:rPr>
+      </w:pPr>
+      <w:r>
+        <w:rPr>
+          <w:lang w:val="vi-VN"/>
+        </w:rPr>
+        <w:t>“</w:t>
+      </w:r>
+      <w:r>
+        <w:rPr>
+          <w:lang w:val="vi-VN"/>
+        </w:rPr>
+        <w:t>Bạn là một Software Tester / QA Engineer. Hãy thực hiện phân tích và thiết kế test case cho sản phẩm quạt công nghiệp Kim Cương dựa trên thông tin được cung cấp tại:</w:t>
+      </w:r>
+    </w:p>
+    <w:p>
+      <w:pPr>
+        <w:rPr>
+          <w:lang w:val="vi-VN"/>
+        </w:rPr>
+      </w:pPr>
+      <w:r>
+        <w:rPr>
+          <w:lang w:val="vi-VN"/>
+        </w:rPr>
+        <w:t>Product URL:</w:t>
+      </w:r>
+    </w:p>
+    <w:p>
+      <w:pPr>
+        <w:rPr>
+          <w:lang w:val="vi-VN"/>
+        </w:rPr>
+      </w:pPr>
+      <w:r>
+        <w:rPr>
+          <w:lang w:val="vi-VN"/>
+        </w:rPr>
+        <w:t>[https://giadungkimcuong.vn/quat-cong-nghiep-kim-cuong/](https://giadungkimcuong.vn/quat-cong-nghiep-kim-cuong/)</w:t>
+      </w:r>
+    </w:p>
+    <w:p>
+      <w:pPr>
+        <w:rPr>
+          <w:lang w:val="vi-VN"/>
+        </w:rPr>
+      </w:pPr>
+      <w:r>
+        <w:rPr>
+          <w:lang w:val="vi-VN"/>
+        </w:rPr>
+        <w:t>1. Thu thập và phân tích thông tin</w:t>
+      </w:r>
+    </w:p>
+    <w:p>
+      <w:pPr>
+        <w:rPr>
+          <w:lang w:val="vi-VN"/>
+        </w:rPr>
+      </w:pPr>
+      <w:r>
+        <w:rPr>
+          <w:lang w:val="vi-VN"/>
+        </w:rPr>
+        <w:t>Truy cập trang web trên và đọc kỹ nội dung để xác định:</w:t>
+      </w:r>
+    </w:p>
+    <w:p>
+      <w:pPr>
+        <w:rPr>
+          <w:lang w:val="vi-VN"/>
+        </w:rPr>
+      </w:pPr>
+      <w:r>
+        <w:rPr>
+          <w:lang w:val="vi-VN"/>
+        </w:rPr>
+        <w:lastRenderedPageBreak/>
+        <w:t>Các loại/model quạt được giới thiệu.</w:t>
+      </w:r>
+    </w:p>
+    <w:p>
+      <w:pPr>
+        <w:rPr>
+          <w:lang w:val="vi-VN"/>
+        </w:rPr>
+      </w:pPr>
+      <w:r>
+        <w:rPr>
+          <w:lang w:val="vi-VN"/>
+        </w:rPr>
+        <w:t>Chức năng và cách sử dụng.</w:t>
+      </w:r>
+    </w:p>
+    <w:p>
+      <w:pPr>
+        <w:rPr>
+          <w:lang w:val="vi-VN"/>
+        </w:rPr>
+      </w:pPr>
+      <w:r>
+        <w:rPr>
+          <w:lang w:val="vi-VN"/>
+        </w:rPr>
+        <w:t>Các nút/công tắc điều khiển nếu có.</w:t>
+      </w:r>
+    </w:p>
+    <w:p>
+      <w:pPr>
+        <w:rPr>
+          <w:lang w:val="vi-VN"/>
+        </w:rPr>
+      </w:pPr>
+      <w:r>
+        <w:rPr>
+          <w:lang w:val="vi-VN"/>
+        </w:rPr>
+        <w:t>Các mức tốc độ nếu có.</w:t>
+      </w:r>
+    </w:p>
+    <w:p>
+      <w:pPr>
+        <w:rPr>
+          <w:lang w:val="vi-VN"/>
+        </w:rPr>
+      </w:pPr>
+      <w:r>
+        <w:rPr>
+          <w:lang w:val="vi-VN"/>
+        </w:rPr>
+        <w:t>Chế độ hoạt động nếu có.</w:t>
+      </w:r>
+    </w:p>
+    <w:p>
+      <w:pPr>
+        <w:rPr>
+          <w:lang w:val="vi-VN"/>
+        </w:rPr>
+      </w:pPr>
+      <w:r>
+        <w:rPr>
+          <w:lang w:val="vi-VN"/>
+        </w:rPr>
+        <w:t>Thông số kỹ thuật liên quan đến việc kiểm thử.</w:t>
+      </w:r>
+    </w:p>
+    <w:p>
+      <w:pPr>
+        <w:rPr>
+          <w:lang w:val="vi-VN"/>
+        </w:rPr>
+      </w:pPr>
+      <w:r>
+        <w:rPr>
+          <w:lang w:val="vi-VN"/>
+        </w:rPr>
+        <w:t>Các điều kiện vận hành.</w:t>
+      </w:r>
+    </w:p>
+    <w:p>
+      <w:pPr>
+        <w:rPr>
+          <w:lang w:val="vi-VN"/>
+        </w:rPr>
+      </w:pPr>
+      <w:r>
+        <w:rPr>
+          <w:lang w:val="vi-VN"/>
+        </w:rPr>
+        <w:t>Các hành vi có thể quan sát và xác minh được từ phía người dùng.</w:t>
+      </w:r>
+    </w:p>
+    <w:p>
+      <w:pPr>
+        <w:rPr>
+          <w:lang w:val="vi-VN"/>
+        </w:rPr>
+      </w:pPr>
+      <w:r>
+        <w:rPr>
+          <w:lang w:val="vi-VN"/>
+        </w:rPr>
+        <w:t>Quan trọng: Không được tự bịa chức năng, thông số kỹ thuật hoặc hành vi của sản phẩm. Chỉ sử dụng thông tin có trong trang web hoặc thông tin có nguồn rõ ràng. Nếu một thông tin không được xác định, ghi N/A hoặc Not specified.</w:t>
+      </w:r>
+    </w:p>
+    <w:p>
+      <w:pPr>
+        <w:rPr>
+          <w:lang w:val="vi-VN"/>
+        </w:rPr>
+      </w:pPr>
+      <w:r>
+        <w:rPr>
+          <w:lang w:val="vi-VN"/>
+        </w:rPr>
+        <w:t>2. Xác định phạm vi kiểm thử</w:t>
+      </w:r>
+    </w:p>
+    <w:p>
+      <w:pPr>
+        <w:rPr>
+          <w:lang w:val="vi-VN"/>
+        </w:rPr>
+      </w:pPr>
+      <w:r>
+        <w:rPr>
+          <w:lang w:val="vi-VN"/>
+        </w:rPr>
+        <w:t>Dựa trên thông tin thực tế của sản phẩm, xác định các chức năng/hành vi có thể kiểm thử, chẳng hạn:</w:t>
+      </w:r>
+    </w:p>
+    <w:p>
+      <w:pPr>
+        <w:rPr>
+          <w:lang w:val="vi-VN"/>
+        </w:rPr>
+      </w:pPr>
+      <w:r>
+        <w:rPr>
+          <w:lang w:val="vi-VN"/>
+        </w:rPr>
+        <w:t>Bật/tắt quạt.</w:t>
+      </w:r>
+    </w:p>
+    <w:p>
+      <w:pPr>
+        <w:rPr>
+          <w:lang w:val="vi-VN"/>
+        </w:rPr>
+      </w:pPr>
+      <w:r>
+        <w:rPr>
+          <w:lang w:val="vi-VN"/>
+        </w:rPr>
+        <w:t>Điều chỉnh tốc độ.</w:t>
+      </w:r>
+    </w:p>
+    <w:p>
+      <w:pPr>
+        <w:rPr>
+          <w:lang w:val="vi-VN"/>
+        </w:rPr>
+      </w:pPr>
+      <w:r>
+        <w:rPr>
+          <w:lang w:val="vi-VN"/>
+        </w:rPr>
+        <w:t>Chuyển đổi các mức tốc độ.</w:t>
+      </w:r>
+    </w:p>
+    <w:p>
+      <w:pPr>
+        <w:rPr>
+          <w:lang w:val="vi-VN"/>
+        </w:rPr>
+      </w:pPr>
+      <w:r>
+        <w:rPr>
+          <w:lang w:val="vi-VN"/>
+        </w:rPr>
+        <w:t>Điều khiển hướng gió/đảo gió nếu có.</w:t>
+      </w:r>
+    </w:p>
+    <w:p>
+      <w:pPr>
+        <w:rPr>
+          <w:lang w:val="vi-VN"/>
+        </w:rPr>
+      </w:pPr>
+      <w:r>
+        <w:rPr>
+          <w:lang w:val="vi-VN"/>
+        </w:rPr>
+        <w:t>Hoạt động của nút/công tắc.</w:t>
+      </w:r>
+    </w:p>
+    <w:p>
+      <w:pPr>
+        <w:rPr>
+          <w:lang w:val="vi-VN"/>
+        </w:rPr>
+      </w:pPr>
+      <w:r>
+        <w:rPr>
+          <w:lang w:val="vi-VN"/>
+        </w:rPr>
+        <w:t>Khả năng phản hồi sau thao tác.</w:t>
+      </w:r>
+    </w:p>
+    <w:p>
+      <w:pPr>
+        <w:rPr>
+          <w:lang w:val="vi-VN"/>
+        </w:rPr>
+      </w:pPr>
+      <w:r>
+        <w:rPr>
+          <w:lang w:val="vi-VN"/>
+        </w:rPr>
+        <w:t>Các trường hợp boundary/edge case.</w:t>
+      </w:r>
+    </w:p>
+    <w:p>
+      <w:pPr>
+        <w:rPr>
+          <w:lang w:val="vi-VN"/>
+        </w:rPr>
+      </w:pPr>
+      <w:r>
+        <w:rPr>
+          <w:lang w:val="vi-VN"/>
+        </w:rPr>
+        <w:t>Các trường hợp invalid/negative phù hợp với thiết bị.</w:t>
+      </w:r>
+    </w:p>
+    <w:p>
+      <w:pPr>
+        <w:rPr>
+          <w:lang w:val="vi-VN"/>
+        </w:rPr>
+      </w:pPr>
+      <w:r>
+        <w:rPr>
+          <w:lang w:val="vi-VN"/>
+        </w:rPr>
+        <w:t>Safety/robustness nếu có thể kiểm thử một cách an toàn.</w:t>
+      </w:r>
+    </w:p>
+    <w:p>
+      <w:pPr>
+        <w:rPr>
+          <w:lang w:val="vi-VN"/>
+        </w:rPr>
+      </w:pPr>
+      <w:r>
+        <w:rPr>
+          <w:lang w:val="vi-VN"/>
+        </w:rPr>
+        <w:t>Không đưa vào test case những chức năng không tồn tại hoặc không có cơ sở từ thông tin sản phẩm.</w:t>
+      </w:r>
+    </w:p>
+    <w:p>
+      <w:pPr>
+        <w:rPr>
+          <w:lang w:val="vi-VN"/>
+        </w:rPr>
+      </w:pPr>
+      <w:r>
+        <w:rPr>
+          <w:lang w:val="vi-VN"/>
+        </w:rPr>
+        <w:t>3. Tạo chính xác 15 Test Case</w:t>
+      </w:r>
+    </w:p>
+    <w:p>
+      <w:pPr>
+        <w:rPr>
+          <w:lang w:val="vi-VN"/>
+        </w:rPr>
+      </w:pPr>
+      <w:r>
+        <w:rPr>
+          <w:lang w:val="vi-VN"/>
+        </w:rPr>
+        <w:t>Tạo CHÍNH XÁC 15 test case, từ:</w:t>
+      </w:r>
+    </w:p>
+    <w:p>
+      <w:pPr>
+        <w:rPr>
+          <w:rFonts w:hint="eastAsia"/>
+          <w:lang w:val="vi-VN"/>
+        </w:rPr>
+      </w:pPr>
+      <w:r>
+        <w:rPr>
+          <w:rFonts w:hint="eastAsia"/>
+          <w:lang w:val="vi-VN"/>
+        </w:rPr>
+        <w:t xml:space="preserve">TC-001 </w:t>
+      </w:r>
+      <w:r>
+        <w:rPr>
+          <w:rFonts w:hint="eastAsia"/>
+          <w:lang w:val="vi-VN"/>
+        </w:rPr>
+        <w:t>→</w:t>
+      </w:r>
+      <w:r>
+        <w:rPr>
+          <w:rFonts w:hint="eastAsia"/>
+          <w:lang w:val="vi-VN"/>
+        </w:rPr>
+        <w:t xml:space="preserve"> TC-015</w:t>
+      </w:r>
+    </w:p>
+    <w:p>
+      <w:pPr>
+        <w:rPr>
+          <w:lang w:val="vi-VN"/>
+        </w:rPr>
+      </w:pPr>
+      <w:r>
+        <w:rPr>
+          <w:lang w:val="vi-VN"/>
+        </w:rPr>
+        <w:lastRenderedPageBreak/>
+        <w:t>Không được thiếu hoặc thừa.</w:t>
+      </w:r>
+    </w:p>
+    <w:p>
+      <w:pPr>
+        <w:rPr>
+          <w:lang w:val="vi-VN"/>
+        </w:rPr>
+      </w:pPr>
+      <w:r>
+        <w:rPr>
+          <w:lang w:val="vi-VN"/>
+        </w:rPr>
+        <w:t>Test case phải có sự đa dạng và bao phủ hợp lý:</w:t>
+      </w:r>
+    </w:p>
+    <w:p>
+      <w:pPr>
+        <w:rPr>
+          <w:lang w:val="vi-VN"/>
+        </w:rPr>
+      </w:pPr>
+      <w:r>
+        <w:rPr>
+          <w:lang w:val="vi-VN"/>
+        </w:rPr>
+        <w:t>Positive test cases.</w:t>
+      </w:r>
+    </w:p>
+    <w:p>
+      <w:pPr>
+        <w:rPr>
+          <w:lang w:val="vi-VN"/>
+        </w:rPr>
+      </w:pPr>
+      <w:r>
+        <w:rPr>
+          <w:lang w:val="vi-VN"/>
+        </w:rPr>
+        <w:t>Negative test cases nếu phù hợp.</w:t>
+      </w:r>
+    </w:p>
+    <w:p>
+      <w:pPr>
+        <w:rPr>
+          <w:lang w:val="vi-VN"/>
+        </w:rPr>
+      </w:pPr>
+      <w:r>
+        <w:rPr>
+          <w:lang w:val="vi-VN"/>
+        </w:rPr>
+        <w:t>Boundary/edge cases.</w:t>
+      </w:r>
+    </w:p>
+    <w:p>
+      <w:pPr>
+        <w:rPr>
+          <w:lang w:val="vi-VN"/>
+        </w:rPr>
+      </w:pPr>
+      <w:r>
+        <w:rPr>
+          <w:lang w:val="vi-VN"/>
+        </w:rPr>
+        <w:t>Functional testing.</w:t>
+      </w:r>
+    </w:p>
+    <w:p>
+      <w:pPr>
+        <w:rPr>
+          <w:lang w:val="vi-VN"/>
+        </w:rPr>
+      </w:pPr>
+      <w:r>
+        <w:rPr>
+          <w:lang w:val="vi-VN"/>
+        </w:rPr>
+        <w:t>User interaction.</w:t>
+      </w:r>
+    </w:p>
+    <w:p>
+      <w:pPr>
+        <w:rPr>
+          <w:lang w:val="vi-VN"/>
+        </w:rPr>
+      </w:pPr>
+      <w:r>
+        <w:rPr>
+          <w:lang w:val="vi-VN"/>
+        </w:rPr>
+        <w:t>Safety/robustness nếu phù hợp.</w:t>
+      </w:r>
+    </w:p>
+    <w:p>
+      <w:pPr>
+        <w:rPr>
+          <w:lang w:val="vi-VN"/>
+        </w:rPr>
+      </w:pPr>
+      <w:r>
+        <w:rPr>
+          <w:lang w:val="vi-VN"/>
+        </w:rPr>
+        <w:t>Không tạo nhiều test case chỉ bằng cách thay đổi nhỏ cùng một thao tác.</w:t>
+      </w:r>
+    </w:p>
+    <w:p>
+      <w:pPr>
+        <w:rPr>
+          <w:lang w:val="vi-VN"/>
+        </w:rPr>
+      </w:pPr>
+      <w:r>
+        <w:rPr>
+          <w:lang w:val="vi-VN"/>
+        </w:rPr>
+        <w:t>4. Format của mỗi Test Case</w:t>
+      </w:r>
+    </w:p>
+    <w:p>
+      <w:pPr>
+        <w:rPr>
+          <w:lang w:val="vi-VN"/>
+        </w:rPr>
+      </w:pPr>
+      <w:r>
+        <w:rPr>
+          <w:lang w:val="vi-VN"/>
+        </w:rPr>
+        <w:t>Mỗi test case bắt buộc có đầy đủ:</w:t>
+      </w:r>
+    </w:p>
+    <w:p>
+      <w:pPr>
+        <w:rPr>
+          <w:lang w:val="vi-VN"/>
+        </w:rPr>
+      </w:pPr>
+      <w:r>
+        <w:rPr>
+          <w:lang w:val="vi-VN"/>
+        </w:rPr>
+        <w:t>Field</w:t>
+      </w:r>
+    </w:p>
+    <w:p>
+      <w:pPr>
+        <w:rPr>
+          <w:lang w:val="vi-VN"/>
+        </w:rPr>
+      </w:pPr>
+      <w:r>
+        <w:rPr>
+          <w:lang w:val="vi-VN"/>
+        </w:rPr>
+        <w:t>Description</w:t>
+      </w:r>
+    </w:p>
+    <w:p>
+      <w:pPr>
+        <w:rPr>
+          <w:lang w:val="vi-VN"/>
+        </w:rPr>
+      </w:pPr>
+      <w:r>
+        <w:rPr>
+          <w:lang w:val="vi-VN"/>
+        </w:rPr>
+        <w:t>Test Case ID</w:t>
+      </w:r>
+    </w:p>
+    <w:p>
+      <w:pPr>
+        <w:rPr>
+          <w:lang w:val="vi-VN"/>
+        </w:rPr>
+      </w:pPr>
+      <w:r>
+        <w:rPr>
+          <w:lang w:val="vi-VN"/>
+        </w:rPr>
+        <w:t>TC-001 đến TC-015</w:t>
+      </w:r>
+    </w:p>
+    <w:p>
+      <w:pPr>
+        <w:rPr>
+          <w:lang w:val="vi-VN"/>
+        </w:rPr>
+      </w:pPr>
+      <w:r>
+        <w:rPr>
+          <w:lang w:val="vi-VN"/>
+        </w:rPr>
+        <w:t>Test Case Title</w:t>
+      </w:r>
+    </w:p>
+    <w:p>
+      <w:pPr>
+        <w:rPr>
+          <w:lang w:val="vi-VN"/>
+        </w:rPr>
+      </w:pPr>
+      <w:r>
+        <w:rPr>
+          <w:lang w:val="vi-VN"/>
+        </w:rPr>
+        <w:t>Tên test case ngắn gọn</w:t>
+      </w:r>
+    </w:p>
+    <w:p>
+      <w:pPr>
+        <w:rPr>
+          <w:lang w:val="vi-VN"/>
+        </w:rPr>
+      </w:pPr>
+      <w:r>
+        <w:rPr>
+          <w:lang w:val="vi-VN"/>
+        </w:rPr>
+        <w:t>Objective</w:t>
+      </w:r>
+    </w:p>
+    <w:p>
+      <w:pPr>
+        <w:rPr>
+          <w:lang w:val="vi-VN"/>
+        </w:rPr>
+      </w:pPr>
+      <w:r>
+        <w:rPr>
+          <w:lang w:val="vi-VN"/>
+        </w:rPr>
+        <w:t>Mục tiêu kiểm thử</w:t>
+      </w:r>
+    </w:p>
+    <w:p>
+      <w:pPr>
+        <w:rPr>
+          <w:lang w:val="vi-VN"/>
+        </w:rPr>
+      </w:pPr>
+      <w:r>
+        <w:rPr>
+          <w:lang w:val="vi-VN"/>
+        </w:rPr>
+        <w:t>Preconditions</w:t>
+      </w:r>
+    </w:p>
+    <w:p>
+      <w:pPr>
+        <w:rPr>
+          <w:lang w:val="vi-VN"/>
+        </w:rPr>
+      </w:pPr>
+      <w:r>
+        <w:rPr>
+          <w:lang w:val="vi-VN"/>
+        </w:rPr>
+        <w:t>Điều kiện tiên quyết</w:t>
+      </w:r>
+    </w:p>
+    <w:p>
+      <w:pPr>
+        <w:rPr>
+          <w:lang w:val="vi-VN"/>
+        </w:rPr>
+      </w:pPr>
+      <w:r>
+        <w:rPr>
+          <w:lang w:val="vi-VN"/>
+        </w:rPr>
+        <w:t>Test Data</w:t>
+      </w:r>
+    </w:p>
+    <w:p>
+      <w:pPr>
+        <w:rPr>
+          <w:lang w:val="vi-VN"/>
+        </w:rPr>
+      </w:pPr>
+      <w:r>
+        <w:rPr>
+          <w:lang w:val="vi-VN"/>
+        </w:rPr>
+        <w:t>Dữ liệu/thao tác đầu vào</w:t>
+      </w:r>
+    </w:p>
+    <w:p>
+      <w:pPr>
+        <w:rPr>
+          <w:lang w:val="vi-VN"/>
+        </w:rPr>
+      </w:pPr>
+      <w:r>
+        <w:rPr>
+          <w:lang w:val="vi-VN"/>
+        </w:rPr>
+        <w:t>Test Steps</w:t>
+      </w:r>
+    </w:p>
+    <w:p>
+      <w:pPr>
+        <w:rPr>
+          <w:lang w:val="vi-VN"/>
+        </w:rPr>
+      </w:pPr>
+      <w:r>
+        <w:rPr>
+          <w:lang w:val="vi-VN"/>
+        </w:rPr>
+        <w:t>Các bước thực hiện</w:t>
+      </w:r>
+    </w:p>
+    <w:p>
+      <w:pPr>
+        <w:rPr>
+          <w:lang w:val="vi-VN"/>
+        </w:rPr>
+      </w:pPr>
+      <w:r>
+        <w:rPr>
+          <w:lang w:val="vi-VN"/>
+        </w:rPr>
+        <w:t>Expected Result</w:t>
+      </w:r>
+    </w:p>
+    <w:p>
+      <w:pPr>
+        <w:rPr>
+          <w:lang w:val="vi-VN"/>
+        </w:rPr>
+      </w:pPr>
+      <w:r>
+        <w:rPr>
+          <w:lang w:val="vi-VN"/>
+        </w:rPr>
+        <w:lastRenderedPageBreak/>
+        <w:t>Kết quả mong đợi</w:t>
+      </w:r>
+    </w:p>
+    <w:p>
+      <w:pPr>
+        <w:rPr>
+          <w:lang w:val="vi-VN"/>
+        </w:rPr>
+      </w:pPr>
+      <w:r>
+        <w:rPr>
+          <w:lang w:val="vi-VN"/>
+        </w:rPr>
+        <w:t>Priority</w:t>
+      </w:r>
+    </w:p>
+    <w:p>
+      <w:pPr>
+        <w:rPr>
+          <w:lang w:val="vi-VN"/>
+        </w:rPr>
+      </w:pPr>
+      <w:r>
+        <w:rPr>
+          <w:lang w:val="vi-VN"/>
+        </w:rPr>
+        <w:t>High / Medium / Low</w:t>
+      </w:r>
+    </w:p>
+    <w:p>
+      <w:pPr>
+        <w:rPr>
+          <w:lang w:val="vi-VN"/>
+        </w:rPr>
+      </w:pPr>
+      <w:r>
+        <w:rPr>
+          <w:lang w:val="vi-VN"/>
+        </w:rPr>
+        <w:t>Test Type</w:t>
+      </w:r>
+    </w:p>
+    <w:p>
+      <w:pPr>
+        <w:rPr>
+          <w:lang w:val="vi-VN"/>
+        </w:rPr>
+      </w:pPr>
+      <w:r>
+        <w:rPr>
+          <w:lang w:val="vi-VN"/>
+        </w:rPr>
+        <w:t>Functional / Negative / Boundary / Safety / etc.</w:t>
+      </w:r>
+    </w:p>
+    <w:p>
+      <w:pPr>
+        <w:rPr>
+          <w:lang w:val="vi-VN"/>
+        </w:rPr>
+      </w:pPr>
+      <w:r>
+        <w:rPr>
+          <w:lang w:val="vi-VN"/>
+        </w:rPr>
+        <w:t>5. Quy tắc viết Test Case</w:t>
+      </w:r>
+    </w:p>
+    <w:p>
+      <w:pPr>
+        <w:rPr>
+          <w:lang w:val="vi-VN"/>
+        </w:rPr>
+      </w:pPr>
+      <w:r>
+        <w:rPr>
+          <w:lang w:val="vi-VN"/>
+        </w:rPr>
+        <w:t>Test case phải có khả năng thực hiện trên sản phẩm thực tế.</w:t>
+      </w:r>
+    </w:p>
+    <w:p>
+      <w:pPr>
+        <w:rPr>
+          <w:lang w:val="vi-VN"/>
+        </w:rPr>
+      </w:pPr>
+      <w:r>
+        <w:rPr>
+          <w:lang w:val="vi-VN"/>
+        </w:rPr>
+        <w:t>Test steps phải rõ ràng và đánh số.</w:t>
+      </w:r>
+    </w:p>
+    <w:p>
+      <w:pPr>
+        <w:rPr>
+          <w:lang w:val="vi-VN"/>
+        </w:rPr>
+      </w:pPr>
+      <w:r>
+        <w:rPr>
+          <w:lang w:val="vi-VN"/>
+        </w:rPr>
+        <w:t>Expected Result phải cụ thể và có thể xác minh.</w:t>
+      </w:r>
+    </w:p>
+    <w:p>
+      <w:pPr>
+        <w:rPr>
+          <w:lang w:val="vi-VN"/>
+        </w:rPr>
+      </w:pPr>
+      <w:r>
+        <w:rPr>
+          <w:lang w:val="vi-VN"/>
+        </w:rPr>
+        <w:t>Không viết expected result chung chung như "quạt hoạt động bình thường".</w:t>
+      </w:r>
+    </w:p>
+    <w:p>
+      <w:pPr>
+        <w:rPr>
+          <w:lang w:val="vi-VN"/>
+        </w:rPr>
+      </w:pPr>
+      <w:r>
+        <w:rPr>
+          <w:lang w:val="vi-VN"/>
+        </w:rPr>
+        <w:t>Không tự suy đoán chức năng.</w:t>
+      </w:r>
+    </w:p>
+    <w:p>
+      <w:pPr>
+        <w:rPr>
+          <w:lang w:val="vi-VN"/>
+        </w:rPr>
+      </w:pPr>
+      <w:r>
+        <w:rPr>
+          <w:lang w:val="vi-VN"/>
+        </w:rPr>
+        <w:t>Không duplicate test case.</w:t>
+      </w:r>
+    </w:p>
+    <w:p>
+      <w:pPr>
+        <w:rPr>
+          <w:lang w:val="vi-VN"/>
+        </w:rPr>
+      </w:pPr>
+      <w:r>
+        <w:rPr>
+          <w:lang w:val="vi-VN"/>
+        </w:rPr>
+        <w:t>Không sử dụng thông số chưa được xác nhận.</w:t>
+      </w:r>
+    </w:p>
+    <w:p>
+      <w:pPr>
+        <w:rPr>
+          <w:lang w:val="vi-VN"/>
+        </w:rPr>
+      </w:pPr>
+      <w:r>
+        <w:rPr>
+          <w:lang w:val="vi-VN"/>
+        </w:rPr>
+        <w:t>Nếu cần assumption, phải ghi rõ assumption.</w:t>
+      </w:r>
+    </w:p>
+    <w:p>
+      <w:pPr>
+        <w:rPr>
+          <w:lang w:val="vi-VN"/>
+        </w:rPr>
+      </w:pPr>
+      <w:r>
+        <w:rPr>
+          <w:lang w:val="vi-VN"/>
+        </w:rPr>
+        <w:t>Các bước test phải phù hợp với cách sử dụng thực tế của sản phẩm.</w:t>
+      </w:r>
+    </w:p>
+    <w:p>
+      <w:pPr>
+        <w:rPr>
+          <w:lang w:val="vi-VN"/>
+        </w:rPr>
+      </w:pPr>
+      <w:r>
+        <w:rPr>
+          <w:lang w:val="vi-VN"/>
+        </w:rPr>
+        <w:t>Ưu tiên kiểm thử hành vi mà người dùng thực sự có thể thực hiện và quan sát.</w:t>
+      </w:r>
+    </w:p>
+    <w:p>
+      <w:pPr>
+        <w:rPr>
+          <w:lang w:val="vi-VN"/>
+        </w:rPr>
+      </w:pPr>
+      <w:r>
+        <w:rPr>
+          <w:lang w:val="vi-VN"/>
+        </w:rPr>
+        <w:t>6. Quality Check</w:t>
+      </w:r>
+    </w:p>
+    <w:p>
+      <w:pPr>
+        <w:rPr>
+          <w:lang w:val="vi-VN"/>
+        </w:rPr>
+      </w:pPr>
+      <w:r>
+        <w:rPr>
+          <w:lang w:val="vi-VN"/>
+        </w:rPr>
+        <w:t>Trước khi xuất file, hãy tự kiểm tra toàn bộ test case:</w:t>
+      </w:r>
+    </w:p>
+    <w:p>
+      <w:pPr>
+        <w:rPr>
+          <w:lang w:val="vi-VN"/>
+        </w:rPr>
+      </w:pPr>
+      <w:r>
+        <w:rPr>
+          <w:lang w:val="vi-VN"/>
+        </w:rPr>
+        <w:t>Có đúng 15 test case không?</w:t>
+      </w:r>
+    </w:p>
+    <w:p>
+      <w:pPr>
+        <w:rPr>
+          <w:lang w:val="vi-VN"/>
+        </w:rPr>
+      </w:pPr>
+      <w:r>
+        <w:rPr>
+          <w:lang w:val="vi-VN"/>
+        </w:rPr>
+        <w:t>ID có liên tục từ TC-001 đến TC-015 không?</w:t>
+      </w:r>
+    </w:p>
+    <w:p>
+      <w:pPr>
+        <w:rPr>
+          <w:lang w:val="vi-VN"/>
+        </w:rPr>
+      </w:pPr>
+      <w:r>
+        <w:rPr>
+          <w:lang w:val="vi-VN"/>
+        </w:rPr>
+        <w:t>Mỗi test case có đầy đủ 9 field không?</w:t>
+      </w:r>
+    </w:p>
+    <w:p>
+      <w:pPr>
+        <w:rPr>
+          <w:lang w:val="vi-VN"/>
+        </w:rPr>
+      </w:pPr>
+      <w:r>
+        <w:rPr>
+          <w:lang w:val="vi-VN"/>
+        </w:rPr>
+        <w:t>Có test case nào bị trùng không?</w:t>
+      </w:r>
+    </w:p>
+    <w:p>
+      <w:pPr>
+        <w:rPr>
+          <w:lang w:val="vi-VN"/>
+        </w:rPr>
+      </w:pPr>
+      <w:r>
+        <w:rPr>
+          <w:lang w:val="vi-VN"/>
+        </w:rPr>
+        <w:t>Các chức năng chính của sản phẩm đã được bao phủ chưa?</w:t>
+      </w:r>
+    </w:p>
+    <w:p>
+      <w:pPr>
+        <w:rPr>
+          <w:lang w:val="vi-VN"/>
+        </w:rPr>
+      </w:pPr>
+      <w:r>
+        <w:rPr>
+          <w:lang w:val="vi-VN"/>
+        </w:rPr>
+        <w:t>Có positive, negative/boundary test phù hợp chưa?</w:t>
+      </w:r>
+    </w:p>
+    <w:p>
+      <w:pPr>
+        <w:rPr>
+          <w:lang w:val="vi-VN"/>
+        </w:rPr>
+      </w:pPr>
+      <w:r>
+        <w:rPr>
+          <w:lang w:val="vi-VN"/>
+        </w:rPr>
+        <w:t>Expected Result có cụ thể và có thể verify không?</w:t>
+      </w:r>
+    </w:p>
+    <w:p>
+      <w:pPr>
+        <w:rPr>
+          <w:lang w:val="vi-VN"/>
+        </w:rPr>
+      </w:pPr>
+      <w:r>
+        <w:rPr>
+          <w:lang w:val="vi-VN"/>
+        </w:rPr>
+        <w:t>Có thông tin nào bị AI tự bịa không?</w:t>
+      </w:r>
+    </w:p>
+    <w:p>
+      <w:pPr>
+        <w:rPr>
+          <w:lang w:val="vi-VN"/>
+        </w:rPr>
+      </w:pPr>
+      <w:r>
+        <w:rPr>
+          <w:lang w:val="vi-VN"/>
+        </w:rPr>
+        <w:lastRenderedPageBreak/>
+        <w:t>Tất cả test case có thể thực hiện trên sản phẩm thực tế không?</w:t>
+      </w:r>
+    </w:p>
+    <w:p>
+      <w:pPr>
+        <w:rPr>
+          <w:lang w:val="vi-VN"/>
+        </w:rPr>
+      </w:pPr>
+      <w:r>
+        <w:rPr>
+          <w:lang w:val="vi-VN"/>
+        </w:rPr>
+        <w:t>Nếu phát hiện vấn đề, hãy tự sửa trước khi xuất file.</w:t>
+      </w:r>
+    </w:p>
+    <w:p>
+      <w:pPr>
+        <w:rPr>
+          <w:lang w:val="vi-VN"/>
+        </w:rPr>
+      </w:pPr>
+      <w:r>
+        <w:rPr>
+          <w:lang w:val="vi-VN"/>
+        </w:rPr>
+        <w:t>7. Xuất file Markdown</w:t>
+      </w:r>
+    </w:p>
+    <w:p>
+      <w:pPr>
+        <w:rPr>
+          <w:lang w:val="vi-VN"/>
+        </w:rPr>
+      </w:pPr>
+      <w:r>
+        <w:rPr>
+          <w:lang w:val="vi-VN"/>
+        </w:rPr>
+        <w:t>Tạo file thực tế với tên chính xác:</w:t>
+      </w:r>
+    </w:p>
+    <w:p>
+      <w:pPr>
+        <w:rPr>
+          <w:lang w:val="vi-VN"/>
+        </w:rPr>
+      </w:pPr>
+      <w:r>
+        <w:rPr>
+          <w:lang w:val="vi-VN"/>
+        </w:rPr>
+        <w:t>test-case.md</w:t>
+      </w:r>
+    </w:p>
+    <w:p>
+      <w:pPr>
+        <w:rPr>
+          <w:lang w:val="vi-VN"/>
+        </w:rPr>
+      </w:pPr>
+      <w:r>
+        <w:rPr>
+          <w:lang w:val="vi-VN"/>
+        </w:rPr>
+        <w:t>Nội dung file phải có cấu trúc:</w:t>
+      </w:r>
+    </w:p>
+    <w:p>
+      <w:pPr>
+        <w:rPr>
+          <w:lang w:val="vi-VN"/>
+        </w:rPr>
+      </w:pPr>
+      <w:r>
+        <w:rPr>
+          <w:lang w:val="vi-VN"/>
+        </w:rPr>
+        <w:t># Test Cases – Quạt công nghiệp Kim Cương ## Product Information - Product: Quạt công nghiệp Kim Cương - Source: https://giadungkimcuong.vn/quat-cong-nghiep-kim-cuong/ ## Test Case Summary | ID | Test Case Title | Priority | Test Type | |---|---|---|---| | TC-001 | ... | ... | ... | | TC-002 | ... | ... | ... | | ... | ... | ... | ... | | TC-015 | ... | ... | ... | --- ## Detailed Test Cases ### TC-001 – [Test Case Title] **Objective:** ... **Preconditions:** ... **Test Data:** ... **Test Steps:** 1. ... 2. ... 3. ... **Expected Result:** ... **Priority:** High **Test Type:** Functional --- ### TC-002 – [Test Case Title] ...</w:t>
+      </w:r>
+    </w:p>
+    <w:p>
+      <w:pPr>
+        <w:rPr>
+          <w:lang w:val="vi-VN"/>
+        </w:rPr>
+      </w:pPr>
+      <w:r>
+        <w:rPr>
+          <w:lang w:val="vi-VN"/>
+        </w:rPr>
+        <w:t>Final Requirement</w:t>
+      </w:r>
+    </w:p>
+    <w:p>
+      <w:pPr>
+        <w:rPr>
+          <w:lang w:val="vi-VN"/>
+        </w:rPr>
+      </w:pPr>
+      <w:r>
+        <w:rPr>
+          <w:lang w:val="vi-VN"/>
+        </w:rPr>
+        <w:t>Sau khi hoàn thành:</w:t>
+      </w:r>
+    </w:p>
+    <w:p>
+      <w:pPr>
+        <w:rPr>
+          <w:lang w:val="vi-VN"/>
+        </w:rPr>
+      </w:pPr>
+      <w:r>
+        <w:rPr>
+          <w:lang w:val="vi-VN"/>
+        </w:rPr>
+        <w:t>Tạo file test-case.md.</w:t>
+      </w:r>
+    </w:p>
+    <w:p>
+      <w:pPr>
+        <w:rPr>
+          <w:lang w:val="vi-VN"/>
+        </w:rPr>
+      </w:pPr>
+      <w:r>
+        <w:rPr>
+          <w:lang w:val="vi-VN"/>
+        </w:rPr>
+        <w:t>Đảm bảo file chứa chính xác 15 test case.</w:t>
+      </w:r>
+    </w:p>
+    <w:p>
+      <w:pPr>
+        <w:rPr>
+          <w:lang w:val="vi-VN"/>
+        </w:rPr>
+      </w:pPr>
+      <w:r>
+        <w:rPr>
+          <w:lang w:val="vi-VN"/>
+        </w:rPr>
+        <w:t>Kiểm tra lại nội dung file trước khi hoàn tất.</w:t>
+      </w:r>
+    </w:p>
+    <w:p>
+      <w:pPr>
+        <w:rPr>
+          <w:lang w:val="vi-VN"/>
+        </w:rPr>
+      </w:pPr>
+      <w:r>
+        <w:rPr>
+          <w:lang w:val="vi-VN"/>
+        </w:rPr>
+        <w:t>Cung cấp file để tôi tải xuống.</w:t>
+      </w:r>
+    </w:p>
+    <w:p>
+      <w:pPr>
+        <w:rPr>
+          <w:lang w:val="vi-VN"/>
+        </w:rPr>
+      </w:pPr>
+      <w:r>
+        <w:rPr>
+          <w:lang w:val="vi-VN"/>
+        </w:rPr>
+        <w:t>Không chỉ trả nội dung Markdown trong chat.</w:t>
+      </w:r>
+      <w:r>
+        <w:rPr>
+          <w:lang w:val="vi-VN"/>
+        </w:rPr>
+        <w:t>”</w:t>
+      </w:r>
+    </w:p>
+    <w:p>
+      <w:pPr>
+        <w:pStyle w:val="ListParagraph"/>
+        <w:numPr>
+          <w:ilvl w:val="0"/>
+          <w:numId w:val="14"/>
+        </w:numPr>
+        <w:rPr>
+          <w:rFonts w:ascii="Arial" w:hAnsi="Arial"/>
+          <w:lang w:val="vi-VN"/>
+        </w:rPr>
+      </w:pPr>
+      <w:r>
+        <w:rPr>
+          <w:rFonts w:ascii="Arial" w:hAnsi="Arial"/>
+          <w:lang w:val="vi-VN"/>
+        </w:rPr>
+        <w:t>Prompt 2:</w:t>
+      </w:r>
+    </w:p>
+    <w:p>
+      <w:pPr>
+        <w:rPr>
+          <w:rFonts w:ascii="Arial" w:hAnsi="Arial"/>
+          <w:lang w:val="vi-VN"/>
+        </w:rPr>
+      </w:pPr>
+      <w:r>
+        <w:rPr>
+          <w:rFonts w:ascii="Arial" w:hAnsi="Arial"/>
+          <w:lang w:val="vi-VN"/>
+        </w:rPr>
+        <w:t>“</w:t>
+      </w:r>
+      <w:r>
+        <w:rPr>
+          <w:rFonts w:ascii="Arial" w:hAnsi="Arial"/>
+          <w:lang w:val="vi-VN"/>
+        </w:rPr>
+        <w:t>Read the file `2026.HW01.Jobs.Defects.PhysicalProduct_En.md` carefully.</w:t>
+      </w:r>
+    </w:p>
+    <w:p>
+      <w:pPr>
+        <w:rPr>
+          <w:rFonts w:ascii="Arial" w:hAnsi="Arial"/>
+          <w:lang w:val="vi-VN"/>
+        </w:rPr>
+      </w:pPr>
+    </w:p>
+    <w:p>
+      <w:pPr>
+        <w:rPr>
+          <w:rFonts w:ascii="Arial" w:hAnsi="Arial"/>
+          <w:lang w:val="vi-VN"/>
+        </w:rPr>
+      </w:pPr>
+      <w:r>
+        <w:rPr>
+          <w:rFonts w:ascii="Arial" w:hAnsi="Arial"/>
+          <w:lang w:val="vi-VN"/>
+        </w:rPr>
+        <w:t>Based on the requirements and instructions in that file, create a detailed outline for the report.</w:t>
+      </w:r>
+    </w:p>
+    <w:p>
+      <w:pPr>
+        <w:rPr>
+          <w:rFonts w:ascii="Arial" w:hAnsi="Arial"/>
+          <w:lang w:val="vi-VN"/>
+        </w:rPr>
+      </w:pPr>
+    </w:p>
+    <w:p>
+      <w:pPr>
+        <w:rPr>
+          <w:rFonts w:ascii="Arial" w:hAnsi="Arial"/>
+          <w:lang w:val="vi-VN"/>
+        </w:rPr>
+      </w:pPr>
+      <w:r>
+        <w:rPr>
+          <w:rFonts w:ascii="Arial" w:hAnsi="Arial"/>
+          <w:lang w:val="vi-VN"/>
+        </w:rPr>
+        <w:t>Then write the report outline into the `report-by-antigraavity` file.</w:t>
+      </w:r>
+    </w:p>
+    <w:p>
+      <w:pPr>
+        <w:rPr>
+          <w:rFonts w:ascii="Arial" w:hAnsi="Arial"/>
+          <w:lang w:val="vi-VN"/>
+        </w:rPr>
+      </w:pPr>
+    </w:p>
+    <w:p>
+      <w:pPr>
+        <w:rPr>
+          <w:rFonts w:ascii="Arial" w:hAnsi="Arial"/>
+          <w:lang w:val="vi-VN"/>
+        </w:rPr>
+      </w:pPr>
+      <w:r>
+        <w:rPr>
+          <w:rFonts w:ascii="Arial" w:hAnsi="Arial"/>
+          <w:lang w:val="vi-VN"/>
+        </w:rPr>
+        <w:lastRenderedPageBreak/>
+        <w:t>Do not write the full report yet. Only create the report structure/outline, including the main sections, subsections, and what should be covered in each section.</w:t>
+      </w:r>
+      <w:r>
+        <w:rPr>
+          <w:rFonts w:ascii="Arial" w:hAnsi="Arial"/>
+          <w:lang w:val="vi-VN"/>
+        </w:rPr>
+        <w:t>”</w:t>
+      </w:r>
+    </w:p>
+    <w:p>
+      <w:pPr>
+        <w:pStyle w:val="ListParagraph"/>
+        <w:numPr>
+          <w:ilvl w:val="0"/>
+          <w:numId w:val="14"/>
+        </w:numPr>
+      </w:pPr>
+      <w:r>
+        <w:t>Prompt</w:t>
+      </w:r>
+      <w:r>
+        <w:rPr>
+          <w:lang w:val="vi-VN"/>
+        </w:rPr>
+        <w:t xml:space="preserve"> 3:</w:t>
+      </w:r>
+    </w:p>
+    <w:p>
+      <w:pPr>
+        <w:rPr>
+          <w:lang w:val="vi-VN"/>
+        </w:rPr>
+      </w:pPr>
+      <w:r>
+        <w:rPr>
+          <w:lang w:val="vi-VN"/>
+        </w:rPr>
+        <w:t>“</w:t>
+      </w:r>
+      <w:r>
+        <w:rPr>
+          <w:lang w:val="vi-VN"/>
+        </w:rPr>
+        <w:t>Find **20 publicly documented software defects/vulnerabilities** reported between **2022 and 2026**.</w:t>
+      </w:r>
+    </w:p>
+    <w:p>
+      <w:pPr>
+        <w:rPr>
+          <w:lang w:val="vi-VN"/>
+        </w:rPr>
+      </w:pPr>
+    </w:p>
+    <w:p>
+      <w:pPr>
+        <w:rPr>
+          <w:lang w:val="vi-VN"/>
+        </w:rPr>
+      </w:pPr>
+      <w:r>
+        <w:rPr>
+          <w:lang w:val="vi-VN"/>
+        </w:rPr>
+        <w:t>### Mandatory Requirements</w:t>
+      </w:r>
+    </w:p>
+    <w:p>
+      <w:pPr>
+        <w:rPr>
+          <w:lang w:val="vi-VN"/>
+        </w:rPr>
+      </w:pPr>
+    </w:p>
+    <w:p>
+      <w:pPr>
+        <w:rPr>
+          <w:lang w:val="vi-VN"/>
+        </w:rPr>
+      </w:pPr>
+      <w:r>
+        <w:rPr>
+          <w:lang w:val="vi-VN"/>
+        </w:rPr>
+        <w:t>* Find exactly **20 defects**.</w:t>
+      </w:r>
+    </w:p>
+    <w:p>
+      <w:pPr>
+        <w:rPr>
+          <w:lang w:val="vi-VN"/>
+        </w:rPr>
+      </w:pPr>
+      <w:r>
+        <w:rPr>
+          <w:lang w:val="vi-VN"/>
+        </w:rPr>
+        <w:t>* At least **7 defects must be related to AI/LLM**, such as:</w:t>
+      </w:r>
+    </w:p>
+    <w:p>
+      <w:pPr>
+        <w:rPr>
+          <w:lang w:val="vi-VN"/>
+        </w:rPr>
+      </w:pPr>
+    </w:p>
+    <w:p>
+      <w:pPr>
+        <w:rPr>
+          <w:lang w:val="vi-VN"/>
+        </w:rPr>
+      </w:pPr>
+      <w:r>
+        <w:rPr>
+          <w:lang w:val="vi-VN"/>
+        </w:rPr>
+        <w:t xml:space="preserve">  * Hallucination</w:t>
+      </w:r>
+    </w:p>
+    <w:p>
+      <w:pPr>
+        <w:rPr>
+          <w:lang w:val="vi-VN"/>
+        </w:rPr>
+      </w:pPr>
+      <w:r>
+        <w:rPr>
+          <w:lang w:val="vi-VN"/>
+        </w:rPr>
+        <w:t xml:space="preserve">  * Prompt injection</w:t>
+      </w:r>
+    </w:p>
+    <w:p>
+      <w:pPr>
+        <w:rPr>
+          <w:lang w:val="vi-VN"/>
+        </w:rPr>
+      </w:pPr>
+      <w:r>
+        <w:rPr>
+          <w:lang w:val="vi-VN"/>
+        </w:rPr>
+        <w:t xml:space="preserve">  * AI bias</w:t>
+      </w:r>
+    </w:p>
+    <w:p>
+      <w:pPr>
+        <w:rPr>
+          <w:lang w:val="vi-VN"/>
+        </w:rPr>
+      </w:pPr>
+      <w:r>
+        <w:rPr>
+          <w:lang w:val="vi-VN"/>
+        </w:rPr>
+        <w:t xml:space="preserve">  * Incorrect AI-generated output</w:t>
+      </w:r>
+    </w:p>
+    <w:p>
+      <w:pPr>
+        <w:rPr>
+          <w:lang w:val="vi-VN"/>
+        </w:rPr>
+      </w:pPr>
+      <w:r>
+        <w:rPr>
+          <w:lang w:val="vi-VN"/>
+        </w:rPr>
+        <w:t xml:space="preserve">  * LLM security or reliability defects</w:t>
+      </w:r>
+    </w:p>
+    <w:p>
+      <w:pPr>
+        <w:rPr>
+          <w:lang w:val="vi-VN"/>
+        </w:rPr>
+      </w:pPr>
+      <w:r>
+        <w:rPr>
+          <w:lang w:val="vi-VN"/>
+        </w:rPr>
+        <w:t>* For **each defect**, provide:</w:t>
+      </w:r>
+    </w:p>
+    <w:p>
+      <w:pPr>
+        <w:rPr>
+          <w:lang w:val="vi-VN"/>
+        </w:rPr>
+      </w:pPr>
+    </w:p>
+    <w:p>
+      <w:pPr>
+        <w:rPr>
+          <w:lang w:val="vi-VN"/>
+        </w:rPr>
+      </w:pPr>
+      <w:r>
+        <w:rPr>
+          <w:lang w:val="vi-VN"/>
+        </w:rPr>
+        <w:t xml:space="preserve">  1. Defect name/title</w:t>
+      </w:r>
+    </w:p>
+    <w:p>
+      <w:pPr>
+        <w:rPr>
+          <w:lang w:val="vi-VN"/>
+        </w:rPr>
+      </w:pPr>
+      <w:r>
+        <w:rPr>
+          <w:lang w:val="vi-VN"/>
+        </w:rPr>
+        <w:t xml:space="preserve">  2. Year reported</w:t>
+      </w:r>
+    </w:p>
+    <w:p>
+      <w:pPr>
+        <w:rPr>
+          <w:lang w:val="vi-VN"/>
+        </w:rPr>
+      </w:pPr>
+      <w:r>
+        <w:rPr>
+          <w:lang w:val="vi-VN"/>
+        </w:rPr>
+        <w:t xml:space="preserve">  3. Source link — **must be publicly accessible and currently working**</w:t>
+      </w:r>
+    </w:p>
+    <w:p>
+      <w:pPr>
+        <w:rPr>
+          <w:lang w:val="vi-VN"/>
+        </w:rPr>
+      </w:pPr>
+      <w:r>
+        <w:rPr>
+          <w:lang w:val="vi-VN"/>
+        </w:rPr>
+        <w:t xml:space="preserve">  4. Description of the defect</w:t>
+      </w:r>
+    </w:p>
+    <w:p>
+      <w:pPr>
+        <w:rPr>
+          <w:lang w:val="vi-VN"/>
+        </w:rPr>
+      </w:pPr>
+      <w:r>
+        <w:rPr>
+          <w:lang w:val="vi-VN"/>
+        </w:rPr>
+        <w:t xml:space="preserve">  5. Severity</w:t>
+      </w:r>
+    </w:p>
+    <w:p>
+      <w:pPr>
+        <w:rPr>
+          <w:lang w:val="vi-VN"/>
+        </w:rPr>
+      </w:pPr>
+      <w:r>
+        <w:rPr>
+          <w:lang w:val="vi-VN"/>
+        </w:rPr>
+        <w:t xml:space="preserve">  6. Consequences/impact</w:t>
+      </w:r>
+    </w:p>
+    <w:p>
+      <w:pPr>
+        <w:rPr>
+          <w:lang w:val="vi-VN"/>
+        </w:rPr>
+      </w:pPr>
+      <w:r>
+        <w:rPr>
+          <w:lang w:val="vi-VN"/>
+        </w:rPr>
+        <w:t xml:space="preserve">  7. Solution, fix, mitigation, or resolution</w:t>
+      </w:r>
+    </w:p>
+    <w:p>
+      <w:pPr>
+        <w:rPr>
+          <w:lang w:val="vi-VN"/>
+        </w:rPr>
+      </w:pPr>
+    </w:p>
+    <w:p>
+      <w:pPr>
+        <w:rPr>
+          <w:lang w:val="vi-VN"/>
+        </w:rPr>
+      </w:pPr>
+      <w:r>
+        <w:rPr>
+          <w:lang w:val="vi-VN"/>
+        </w:rPr>
+        <w:t>### NEW Requirement — AI Analysis Error</w:t>
+      </w:r>
+    </w:p>
+    <w:p>
+      <w:pPr>
+        <w:rPr>
+          <w:lang w:val="vi-VN"/>
+        </w:rPr>
+      </w:pPr>
+    </w:p>
+    <w:p>
+      <w:pPr>
+        <w:rPr>
+          <w:lang w:val="vi-VN"/>
+        </w:rPr>
+      </w:pPr>
+      <w:r>
+        <w:rPr>
+          <w:lang w:val="vi-VN"/>
+        </w:rPr>
+        <w:t>For **EVERY one of the 20 defects**, identify **exactly 1 instance** where an AI system (such as ChatGPT, Gemini, Claude, Copilot, or another LLM) **biases or hallucinates when explaining that defect**.</w:t>
+      </w:r>
+    </w:p>
+    <w:p>
+      <w:pPr>
+        <w:rPr>
+          <w:lang w:val="vi-VN"/>
+        </w:rPr>
+      </w:pPr>
+    </w:p>
+    <w:p>
+      <w:pPr>
+        <w:rPr>
+          <w:lang w:val="vi-VN"/>
+        </w:rPr>
+      </w:pPr>
+      <w:r>
+        <w:rPr>
+          <w:lang w:val="vi-VN"/>
+        </w:rPr>
+        <w:t>Therefore, the final report must contain:</w:t>
+      </w:r>
+    </w:p>
+    <w:p>
+      <w:pPr>
+        <w:rPr>
+          <w:lang w:val="vi-VN"/>
+        </w:rPr>
+      </w:pPr>
+    </w:p>
+    <w:p>
+      <w:pPr>
+        <w:rPr>
+          <w:lang w:val="vi-VN"/>
+        </w:rPr>
+      </w:pPr>
+      <w:r>
+        <w:rPr>
+          <w:lang w:val="vi-VN"/>
+        </w:rPr>
+        <w:t>* **20 defects total**</w:t>
+      </w:r>
+    </w:p>
+    <w:p>
+      <w:pPr>
+        <w:rPr>
+          <w:lang w:val="vi-VN"/>
+        </w:rPr>
+      </w:pPr>
+      <w:r>
+        <w:rPr>
+          <w:lang w:val="vi-VN"/>
+        </w:rPr>
+        <w:t>* **20 AI bias/hallucination instances total**</w:t>
+      </w:r>
+    </w:p>
+    <w:p>
+      <w:pPr>
+        <w:rPr>
+          <w:lang w:val="vi-VN"/>
+        </w:rPr>
+      </w:pPr>
+      <w:r>
+        <w:rPr>
+          <w:lang w:val="vi-VN"/>
+        </w:rPr>
+        <w:t>* **1 AI bias/hallucination instance for each defect**</w:t>
+      </w:r>
+    </w:p>
+    <w:p>
+      <w:pPr>
+        <w:rPr>
+          <w:lang w:val="vi-VN"/>
+        </w:rPr>
+      </w:pPr>
+    </w:p>
+    <w:p>
+      <w:pPr>
+        <w:rPr>
+          <w:lang w:val="vi-VN"/>
+        </w:rPr>
+      </w:pPr>
+      <w:r>
+        <w:rPr>
+          <w:lang w:val="vi-VN"/>
+        </w:rPr>
+        <w:t>For each AI error, clearly state:</w:t>
+      </w:r>
+    </w:p>
+    <w:p>
+      <w:pPr>
+        <w:rPr>
+          <w:lang w:val="vi-VN"/>
+        </w:rPr>
+      </w:pPr>
+    </w:p>
+    <w:p>
+      <w:pPr>
+        <w:rPr>
+          <w:lang w:val="vi-VN"/>
+        </w:rPr>
+      </w:pPr>
+      <w:r>
+        <w:rPr>
+          <w:lang w:val="vi-VN"/>
+        </w:rPr>
+        <w:t>* What the AI claimed</w:t>
+      </w:r>
+    </w:p>
+    <w:p>
+      <w:pPr>
+        <w:rPr>
+          <w:lang w:val="vi-VN"/>
+        </w:rPr>
+      </w:pPr>
+      <w:r>
+        <w:rPr>
+          <w:lang w:val="vi-VN"/>
+        </w:rPr>
+        <w:t>* Why the claim is biased or hallucinated</w:t>
+      </w:r>
+    </w:p>
+    <w:p>
+      <w:pPr>
+        <w:rPr>
+          <w:lang w:val="vi-VN"/>
+        </w:rPr>
+      </w:pPr>
+      <w:r>
+        <w:rPr>
+          <w:lang w:val="vi-VN"/>
+        </w:rPr>
+        <w:t>* What the correct information is</w:t>
+      </w:r>
+    </w:p>
+    <w:p>
+      <w:pPr>
+        <w:rPr>
+          <w:lang w:val="vi-VN"/>
+        </w:rPr>
+      </w:pPr>
+      <w:r>
+        <w:rPr>
+          <w:lang w:val="vi-VN"/>
+        </w:rPr>
+        <w:t>* The evidence/source used to verify the correction</w:t>
+      </w:r>
+    </w:p>
+    <w:p>
+      <w:pPr>
+        <w:rPr>
+          <w:lang w:val="vi-VN"/>
+        </w:rPr>
+      </w:pPr>
+    </w:p>
+    <w:p>
+      <w:pPr>
+        <w:rPr>
+          <w:lang w:val="vi-VN"/>
+        </w:rPr>
+      </w:pPr>
+      <w:r>
+        <w:rPr>
+          <w:lang w:val="vi-VN"/>
+        </w:rPr>
+        <w:t>### Source Requirements</w:t>
+      </w:r>
+    </w:p>
+    <w:p>
+      <w:pPr>
+        <w:rPr>
+          <w:lang w:val="vi-VN"/>
+        </w:rPr>
+      </w:pPr>
+    </w:p>
+    <w:p>
+      <w:pPr>
+        <w:rPr>
+          <w:lang w:val="vi-VN"/>
+        </w:rPr>
+      </w:pPr>
+      <w:r>
+        <w:rPr>
+          <w:lang w:val="vi-VN"/>
+        </w:rPr>
+        <w:t>* Verify that every source link is **accessible at the time of research**.</w:t>
+      </w:r>
+    </w:p>
+    <w:p>
+      <w:pPr>
+        <w:rPr>
+          <w:lang w:val="vi-VN"/>
+        </w:rPr>
+      </w:pPr>
+      <w:r>
+        <w:rPr>
+          <w:lang w:val="vi-VN"/>
+        </w:rPr>
+        <w:t>* Replace outdated, broken, redirected-to-nowhere, or inaccessible links with a **currently accessible authoritative source**.</w:t>
+      </w:r>
+    </w:p>
+    <w:p>
+      <w:pPr>
+        <w:rPr>
+          <w:lang w:val="vi-VN"/>
+        </w:rPr>
+      </w:pPr>
+      <w:r>
+        <w:rPr>
+          <w:lang w:val="vi-VN"/>
+        </w:rPr>
+        <w:t>* Prefer official sources such as vendor security advisories, CVE/NVD records, incident reports, official bug trackers, and reputable security research publications.</w:t>
+      </w:r>
+    </w:p>
+    <w:p>
+      <w:pPr>
+        <w:rPr>
+          <w:lang w:val="vi-VN"/>
+        </w:rPr>
+      </w:pPr>
+      <w:r>
+        <w:rPr>
+          <w:lang w:val="vi-VN"/>
+        </w:rPr>
+        <w:t>* Do not fabricate sources, defects, AI outputs, or citations.</w:t>
+      </w:r>
+    </w:p>
+    <w:p>
+      <w:pPr>
+        <w:rPr>
+          <w:lang w:val="vi-VN"/>
+        </w:rPr>
+      </w:pPr>
+      <w:r>
+        <w:rPr>
+          <w:lang w:val="vi-VN"/>
+        </w:rPr>
+        <w:t>* Clearly distinguish documented facts from your own analysis.</w:t>
+      </w:r>
+    </w:p>
+    <w:p>
+      <w:pPr>
+        <w:rPr>
+          <w:lang w:val="vi-VN"/>
+        </w:rPr>
+      </w:pPr>
+    </w:p>
+    <w:p>
+      <w:pPr>
+        <w:rPr>
+          <w:lang w:val="vi-VN"/>
+        </w:rPr>
+      </w:pPr>
+      <w:r>
+        <w:rPr>
+          <w:lang w:val="vi-VN"/>
+        </w:rPr>
+        <w:lastRenderedPageBreak/>
+        <w:t>### Output</w:t>
+      </w:r>
+    </w:p>
+    <w:p>
+      <w:pPr>
+        <w:rPr>
+          <w:lang w:val="vi-VN"/>
+        </w:rPr>
+      </w:pPr>
+    </w:p>
+    <w:p>
+      <w:pPr>
+        <w:rPr>
+          <w:lang w:val="vi-VN"/>
+        </w:rPr>
+      </w:pPr>
+      <w:r>
+        <w:rPr>
+          <w:lang w:val="vi-VN"/>
+        </w:rPr>
+        <w:t>Write the completed Vietnamese report to:</w:t>
+      </w:r>
+    </w:p>
+    <w:p>
+      <w:pPr>
+        <w:rPr>
+          <w:lang w:val="vi-VN"/>
+        </w:rPr>
+      </w:pPr>
+    </w:p>
+    <w:p>
+      <w:pPr>
+        <w:rPr>
+          <w:lang w:val="vi-VN"/>
+        </w:rPr>
+      </w:pPr>
+      <w:r>
+        <w:rPr>
+          <w:lang w:val="vi-VN"/>
+        </w:rPr>
+        <w:t>`result2.md`</w:t>
+      </w:r>
+    </w:p>
+    <w:p>
+      <w:pPr>
+        <w:rPr>
+          <w:lang w:val="vi-VN"/>
+        </w:rPr>
+      </w:pPr>
+    </w:p>
+    <w:p>
+      <w:pPr>
+        <w:rPr>
+          <w:lang w:val="vi-VN"/>
+        </w:rPr>
+      </w:pPr>
+      <w:r>
+        <w:rPr>
+          <w:lang w:val="vi-VN"/>
+        </w:rPr>
+        <w:t>The report should be factual, well-structured, and suitable for submission as a **software testing/security research report**.</w:t>
+      </w:r>
+      <w:r>
+        <w:rPr>
+          <w:lang w:val="vi-VN"/>
+        </w:rPr>
+        <w:t>”</w:t>
       </w:r>
     </w:p>
     <w:p>
       <w:pPr>
         <w:pStyle w:val="Heading3"/>
-      </w:pPr>
-      <w:r>
         <w:rPr>
           <w:rFonts w:ascii="Arial" w:hAnsi="Arial"/>
-        </w:rPr>
-        <w:t>2. Stage(s) of the assignment where AI was used:</w:t>
-      </w:r>
-    </w:p>
-    <w:p>
+          <w:lang w:val="vi-VN"/>
+        </w:rPr>
+      </w:pPr>
       <w:r>
         <w:rPr>
           <w:rFonts w:ascii="Arial" w:hAnsi="Arial"/>
-          <w:i/>
-          <w:color w:val="707070"/>
-          <w:sz w:val="20"/>
-        </w:rPr>
-        <w:t>Tick all that apply: [ ] brainstorming  [ ] outlining  [ ] drafting  [ ] feedback  [ ] revision  [ ] coding  [ ] data analysis  [ ] visual design  [ ] other (specify).</w:t>
-      </w:r>
-    </w:p>
-    <w:p>
+        </w:rPr>
+        <w:t>4. Specific parts of the work AI contributed to:</w:t>
+      </w:r>
+    </w:p>
+    <w:p>
+      <w:pPr>
+        <w:rPr>
+          <w:lang w:val="vi-VN"/>
+        </w:rPr>
+      </w:pPr>
+      <w:r>
+        <w:t>AI contributed to creating the mindmap, generating 15 test cases, outlining the report, researching software defects, and summarizing QA/QC job market information.</w:t>
+      </w:r>
+    </w:p>
+    <w:p>
+      <w:pPr>
+        <w:pStyle w:val="Heading3"/>
+      </w:pPr>
       <w:r>
         <w:rPr>
           <w:rFonts w:ascii="Arial" w:hAnsi="Arial"/>
         </w:rPr>
-        <w:t>__________________________________________________________________________________________</w:t>
-      </w:r>
-    </w:p>
-    <w:p>
+        <w:t>5. How I reviewed, revised, or verified the AI output:</w:t>
+      </w:r>
+    </w:p>
+    <w:p>
+      <w:pPr>
+        <w:rPr>
+          <w:lang w:val="vi-VN"/>
+        </w:rPr>
+      </w:pPr>
+      <w:r>
+        <w:t>I cross-checked the AI output with the ISTQB syllabus and course materials, verified the device information against the manufacturer's website, and manually reviewed the test cases for accuracy, completeness, and duplication.</w:t>
+      </w:r>
+    </w:p>
+    <w:p>
+      <w:pPr>
+        <w:pStyle w:val="Heading3"/>
+      </w:pPr>
       <w:r>
         <w:rPr>
           <w:rFonts w:ascii="Arial" w:hAnsi="Arial"/>
         </w:rPr>
-        <w:t>__________________________________________________________________________________________</w:t>
-      </w:r>
-    </w:p>
-    <w:p>
-      <w:r>
-        <w:rPr>
-          <w:rFonts w:ascii="Arial" w:hAnsi="Arial"/>
-        </w:rPr>
-        <w:lastRenderedPageBreak/>
-        <w:t>__________________________________________________________________________________________</w:t>
-      </w:r>
-    </w:p>
-    <w:p>
-      <w:pPr>
-        <w:pStyle w:val="Heading3"/>
-      </w:pPr>
-      <w:r>
-        <w:rPr>
-          <w:rFonts w:ascii="Arial" w:hAnsi="Arial"/>
-        </w:rPr>
-        <w:t>3. Main prompts or tasks given to the AI:</w:t>
-      </w:r>
-    </w:p>
-    <w:p>
-      <w:r>
-        <w:rPr>
-          <w:rFonts w:ascii="Arial" w:hAnsi="Arial"/>
-          <w:i/>
-          <w:color w:val="707070"/>
-          <w:sz w:val="20"/>
-        </w:rPr>
-        <w:t>Paste the 2–3 most impactful prompts verbatim. For the full transcript, attach Appendix A (prompt_log.md).</w:t>
-      </w:r>
-    </w:p>
-    <w:p>
-      <w:r>
-        <w:rPr>
-          <w:rFonts w:ascii="Arial" w:hAnsi="Arial"/>
-        </w:rPr>
-        <w:t>__________________________________________________________________________________________</w:t>
-      </w:r>
-    </w:p>
-    <w:p>
-      <w:r>
-        <w:rPr>
-          <w:rFonts w:ascii="Arial" w:hAnsi="Arial"/>
-        </w:rPr>
-        <w:t>__________________________________________________________________________________________</w:t>
-      </w:r>
-    </w:p>
-    <w:p>
-      <w:r>
-        <w:rPr>
-          <w:rFonts w:ascii="Arial" w:hAnsi="Arial"/>
-        </w:rPr>
-        <w:t>__________________________________________________________________________________________</w:t>
-      </w:r>
-    </w:p>
-    <w:p>
-      <w:r>
-        <w:rPr>
-          <w:rFonts w:ascii="Arial" w:hAnsi="Arial"/>
-        </w:rPr>
-        <w:t>__________________________________________________________________________________________</w:t>
-      </w:r>
-    </w:p>
-    <w:p>
-      <w:pPr>
-        <w:pStyle w:val="Heading3"/>
-      </w:pPr>
-      <w:r>
-        <w:rPr>
-          <w:rFonts w:ascii="Arial" w:hAnsi="Arial"/>
-        </w:rPr>
-        <w:t>4. Specific parts of the work AI contributed to:</w:t>
-      </w:r>
-    </w:p>
-    <w:p>
-      <w:r>
-        <w:rPr>
-          <w:rFonts w:ascii="Arial" w:hAnsi="Arial"/>
-          <w:i/>
-          <w:color w:val="707070"/>
-          <w:sz w:val="20"/>
-        </w:rPr>
-        <w:t>Be specific. Example: 'AI generated TC01–TC15 in Section 3.2; I rewrote TC04 and TC11; AI did NOT contribute to Sections 1, 2, 4, or the AI Critique.'</w:t>
-      </w:r>
-    </w:p>
-    <w:p>
-      <w:r>
-        <w:rPr>
-          <w:rFonts w:ascii="Arial" w:hAnsi="Arial"/>
-        </w:rPr>
-        <w:t>__________________________________________________________________________________________</w:t>
-      </w:r>
-    </w:p>
-    <w:p>
-      <w:r>
-        <w:rPr>
-          <w:rFonts w:ascii="Arial" w:hAnsi="Arial"/>
-        </w:rPr>
-        <w:t>__________________________________________________________________________________________</w:t>
-      </w:r>
-    </w:p>
-    <w:p>
-      <w:r>
-        <w:rPr>
-          <w:rFonts w:ascii="Arial" w:hAnsi="Arial"/>
-        </w:rPr>
-        <w:t>__________________________________________________________________________________________</w:t>
-      </w:r>
-    </w:p>
-    <w:p>
-      <w:r>
-        <w:rPr>
-          <w:rFonts w:ascii="Arial" w:hAnsi="Arial"/>
-        </w:rPr>
-        <w:t>__________________________________________________________________________________________</w:t>
-      </w:r>
-    </w:p>
-    <w:p>
-      <w:pPr>
-        <w:pStyle w:val="Heading3"/>
-      </w:pPr>
-      <w:r>
-        <w:rPr>
-          <w:rFonts w:ascii="Arial" w:hAnsi="Arial"/>
-        </w:rPr>
-        <w:t>5. How I reviewed, revised, or verified the AI output:</w:t>
-      </w:r>
-    </w:p>
-    <w:p>
-      <w:r>
-        <w:rPr>
-          <w:rFonts w:ascii="Arial" w:hAnsi="Arial"/>
-          <w:i/>
-          <w:color w:val="707070"/>
-          <w:sz w:val="20"/>
-        </w:rPr>
-        <w:t>Describe your verification method (ran the test, checked the spec, asked the TA, looked up RFC, cross-checked with the ISTQB syllabus, etc.).</w:t>
-      </w:r>
-    </w:p>
-    <w:p>
-      <w:r>
-        <w:rPr>
-          <w:rFonts w:ascii="Arial" w:hAnsi="Arial"/>
-        </w:rPr>
-        <w:t>__________________________________________________________________________________________</w:t>
-      </w:r>
-    </w:p>
-    <w:p>
-      <w:r>
-        <w:rPr>
-          <w:rFonts w:ascii="Arial" w:hAnsi="Arial"/>
-        </w:rPr>
-        <w:t>__________________________________________________________________________________________</w:t>
-      </w:r>
-    </w:p>
-    <w:p>
-      <w:r>
-        <w:rPr>
-          <w:rFonts w:ascii="Arial" w:hAnsi="Arial"/>
-        </w:rPr>
-        <w:t>__________________________________________________________________________________________</w:t>
-      </w:r>
-    </w:p>
-    <w:p>
-      <w:r>
-        <w:rPr>
-          <w:rFonts w:ascii="Arial" w:hAnsi="Arial"/>
-        </w:rPr>
-        <w:lastRenderedPageBreak/>
-        <w:t>__________________________________________________________________________________________</w:t>
-      </w:r>
-    </w:p>
-    <w:p>
-      <w:pPr>
-        <w:pStyle w:val="Heading3"/>
-      </w:pPr>
-      <w:r>
-        <w:rPr>
-          <w:rFonts w:ascii="Arial" w:hAnsi="Arial"/>
-        </w:rPr>
         <w:t>6. Citation (if required by course style guide):</w:t>
       </w:r>
     </w:p>
     <w:p>
       <w:r>
-        <w:rPr>
-          <w:rFonts w:ascii="Arial" w:hAnsi="Arial"/>
-          <w:i/>
-          <w:color w:val="707070"/>
-          <w:sz w:val="20"/>
-        </w:rPr>
-        <w:t>Software Testing uses the IEEE style. Example: Anthropic. (2026). AI Tool (e.g., ChatGPT, Claude, Gemini) [Large language model]. https://claude.ai</w:t>
-      </w:r>
-    </w:p>
-    <w:p>
-      <w:r>
-        <w:rPr>
-          <w:rFonts w:ascii="Arial" w:hAnsi="Arial"/>
-        </w:rPr>
-        <w:t>__________________________________________________________________________________________</w:t>
-      </w:r>
-    </w:p>
-    <w:p>
-      <w:r>
-        <w:rPr>
-          <w:rFonts w:ascii="Arial" w:hAnsi="Arial"/>
-        </w:rPr>
-        <w:t>__________________________________________________________________________________________</w:t>
-      </w:r>
-    </w:p>
-    <w:p>
-      <w:r>
-        <w:rPr>
-          <w:rFonts w:ascii="Arial" w:hAnsi="Arial"/>
-        </w:rPr>
-        <w:t>__________________________________________________________________________________________</w:t>
-      </w:r>
-    </w:p>
-    <w:p>
-      <w:r>
-        <w:rPr>
-          <w:rFonts w:ascii="Arial" w:hAnsi="Arial"/>
-        </w:rPr>
-        <w:t>__________________________________________________________________________________________</w:t>
+        <w:t xml:space="preserve">Google. (2026). Gemini [Large language model]. </w:t>
+      </w:r>
+      <w:hyperlink r:id="rId6" w:history="1">
+        <w:r>
+          <w:rPr>
+            <w:rStyle w:val="Hyperlink"/>
+          </w:rPr>
+          <w:t>https://gemini.google.com/</w:t>
+        </w:r>
+      </w:hyperlink>
+    </w:p>
+    <w:p>
+      <w:r>
+        <w:t xml:space="preserve">OpenAI. (2026). ChatGPT [Large language model]. </w:t>
+      </w:r>
+      <w:hyperlink r:id="rId7" w:history="1">
+        <w:r>
+          <w:rPr>
+            <w:rStyle w:val="Hyperlink"/>
+          </w:rPr>
+          <w:t>https://chatgpt.com/</w:t>
+        </w:r>
+      </w:hyperlink>
+    </w:p>
+    <w:p>
+      <w:r>
+        <w:t xml:space="preserve">GitHub. (2026). GitHub Copilot [AI coding assistant]. </w:t>
+      </w:r>
+      <w:hyperlink r:id="rId8" w:history="1">
+        <w:r>
+          <w:rPr>
+            <w:rStyle w:val="Hyperlink"/>
+          </w:rPr>
+          <w:t>https://github.com/features/copilot</w:t>
+        </w:r>
+      </w:hyperlink>
+    </w:p>
+    <w:p>
+      <w:pPr>
+        <w:rPr>
+          <w:lang w:val="vi-VN"/>
+        </w:rPr>
+      </w:pPr>
+      <w:r>
+        <w:t>Google. (2026). Antigravity [AI-powered development environment].</w:t>
       </w:r>
     </w:p>
     <w:p>
@@ -777,7 +2704,16 @@
           <w:p>
             <w:pPr>
               <w:cnfStyle w:val="100000000000" w:firstRow="1" w:lastRow="0" w:firstColumn="0" w:lastColumn="0" w:oddVBand="0" w:evenVBand="0" w:oddHBand="0" w:evenHBand="0" w:firstRowFirstColumn="0" w:firstRowLastColumn="0" w:lastRowFirstColumn="0" w:lastRowLastColumn="0"/>
+              <w:rPr>
+                <w:lang w:val="vi-VN"/>
+              </w:rPr>
             </w:pPr>
+            <w:r>
+              <w:rPr>
+                <w:lang w:val="vi-VN"/>
+              </w:rPr>
+              <w:t>Tran Dai Hiep</w:t>
+            </w:r>
           </w:p>
         </w:tc>
       </w:tr>
@@ -809,6 +2745,9 @@
             <w:pPr>
               <w:cnfStyle w:val="000000100000" w:firstRow="0" w:lastRow="0" w:firstColumn="0" w:lastColumn="0" w:oddVBand="0" w:evenVBand="0" w:oddHBand="1" w:evenHBand="0" w:firstRowFirstColumn="0" w:firstRowLastColumn="0" w:lastRowFirstColumn="0" w:lastRowLastColumn="0"/>
             </w:pPr>
+            <w:r>
+              <w:t>23120256</w:t>
+            </w:r>
           </w:p>
         </w:tc>
       </w:tr>
@@ -954,6 +2893,9 @@
             <w:pPr>
               <w:cnfStyle w:val="000000100000" w:firstRow="0" w:lastRow="0" w:firstColumn="0" w:lastColumn="0" w:oddVBand="0" w:evenVBand="0" w:oddHBand="1" w:evenHBand="0" w:firstRowFirstColumn="0" w:firstRowLastColumn="0" w:lastRowFirstColumn="0" w:lastRowLastColumn="0"/>
             </w:pPr>
+            <w:r>
+              <w:t>27/09/2026</w:t>
+            </w:r>
           </w:p>
         </w:tc>
       </w:tr>
@@ -985,6 +2927,46 @@
             <w:pPr>
               <w:cnfStyle w:val="000000010000" w:firstRow="0" w:lastRow="0" w:firstColumn="0" w:lastColumn="0" w:oddVBand="0" w:evenVBand="0" w:oddHBand="0" w:evenHBand="1" w:firstRowFirstColumn="0" w:firstRowLastColumn="0" w:lastRowFirstColumn="0" w:lastRowLastColumn="0"/>
             </w:pPr>
+            <w:r>
+              <w:rPr>
+                <w:noProof/>
+              </w:rPr>
+              <w:drawing>
+                <wp:inline distT="0" distB="0" distL="0" distR="0" wp14:anchorId="3BFDD217" wp14:editId="677F0BDB">
+                  <wp:extent cx="711200" cy="462498"/>
+                  <wp:effectExtent l="0" t="0" r="0" b="0"/>
+                  <wp:docPr id="1667208668" name="Picture 1"/>
+                  <wp:cNvGraphicFramePr>
+                    <a:graphicFrameLocks xmlns:a="http://schemas.openxmlformats.org/drawingml/2006/main" noChangeAspect="1"/>
+                  </wp:cNvGraphicFramePr>
+                  <a:graphic xmlns:a="http://schemas.openxmlformats.org/drawingml/2006/main">
+                    <a:graphicData uri="http://schemas.openxmlformats.org/drawingml/2006/picture">
+                      <pic:pic xmlns:pic="http://schemas.openxmlformats.org/drawingml/2006/picture">
+                        <pic:nvPicPr>
+                          <pic:cNvPr id="1667208668" name="Picture 1667208668"/>
+                          <pic:cNvPicPr/>
+                        </pic:nvPicPr>
+                        <pic:blipFill>
+                          <a:blip r:embed="rId9"/>
+                          <a:stretch>
+                            <a:fillRect/>
+                          </a:stretch>
+                        </pic:blipFill>
+                        <pic:spPr>
+                          <a:xfrm>
+                            <a:off x="0" y="0"/>
+                            <a:ext cx="718580" cy="467297"/>
+                          </a:xfrm>
+                          <a:prstGeom prst="rect">
+                            <a:avLst/>
+                          </a:prstGeom>
+                        </pic:spPr>
+                      </pic:pic>
+                    </a:graphicData>
+                  </a:graphic>
+                </wp:inline>
+              </w:drawing>
+            </w:r>
           </w:p>
         </w:tc>
       </w:tr>
@@ -997,6 +2979,7 @@
         <w:rPr>
           <w:rFonts w:ascii="Arial" w:hAnsi="Arial"/>
         </w:rPr>
+        <w:lastRenderedPageBreak/>
         <w:t>References</w:t>
       </w:r>
     </w:p>
@@ -1257,6 +3240,571 @@
       </w:pPr>
       <w:rPr>
         <w:rFonts w:ascii="Symbol" w:hAnsi="Symbol" w:hint="default"/>
+      </w:rPr>
+    </w:lvl>
+  </w:abstractNum>
+  <w:abstractNum w:abstractNumId="9" w15:restartNumberingAfterBreak="0">
+    <w:nsid w:val="32727B25"/>
+    <w:multiLevelType w:val="hybridMultilevel"/>
+    <w:tmpl w:val="03205844"/>
+    <w:lvl w:ilvl="0" w:tplc="04090001">
+      <w:start w:val="1"/>
+      <w:numFmt w:val="bullet"/>
+      <w:lvlText w:val=""/>
+      <w:lvlJc w:val="left"/>
+      <w:pPr>
+        <w:ind w:left="720" w:hanging="360"/>
+      </w:pPr>
+      <w:rPr>
+        <w:rFonts w:ascii="Symbol" w:hAnsi="Symbol" w:hint="default"/>
+      </w:rPr>
+    </w:lvl>
+    <w:lvl w:ilvl="1" w:tplc="04090003" w:tentative="1">
+      <w:start w:val="1"/>
+      <w:numFmt w:val="bullet"/>
+      <w:lvlText w:val="o"/>
+      <w:lvlJc w:val="left"/>
+      <w:pPr>
+        <w:ind w:left="1440" w:hanging="360"/>
+      </w:pPr>
+      <w:rPr>
+        <w:rFonts w:ascii="Courier New" w:hAnsi="Courier New" w:cs="Courier New" w:hint="default"/>
+      </w:rPr>
+    </w:lvl>
+    <w:lvl w:ilvl="2" w:tplc="04090005" w:tentative="1">
+      <w:start w:val="1"/>
+      <w:numFmt w:val="bullet"/>
+      <w:lvlText w:val=""/>
+      <w:lvlJc w:val="left"/>
+      <w:pPr>
+        <w:ind w:left="2160" w:hanging="360"/>
+      </w:pPr>
+      <w:rPr>
+        <w:rFonts w:ascii="Wingdings" w:hAnsi="Wingdings" w:hint="default"/>
+      </w:rPr>
+    </w:lvl>
+    <w:lvl w:ilvl="3" w:tplc="04090001" w:tentative="1">
+      <w:start w:val="1"/>
+      <w:numFmt w:val="bullet"/>
+      <w:lvlText w:val=""/>
+      <w:lvlJc w:val="left"/>
+      <w:pPr>
+        <w:ind w:left="2880" w:hanging="360"/>
+      </w:pPr>
+      <w:rPr>
+        <w:rFonts w:ascii="Symbol" w:hAnsi="Symbol" w:hint="default"/>
+      </w:rPr>
+    </w:lvl>
+    <w:lvl w:ilvl="4" w:tplc="04090003" w:tentative="1">
+      <w:start w:val="1"/>
+      <w:numFmt w:val="bullet"/>
+      <w:lvlText w:val="o"/>
+      <w:lvlJc w:val="left"/>
+      <w:pPr>
+        <w:ind w:left="3600" w:hanging="360"/>
+      </w:pPr>
+      <w:rPr>
+        <w:rFonts w:ascii="Courier New" w:hAnsi="Courier New" w:cs="Courier New" w:hint="default"/>
+      </w:rPr>
+    </w:lvl>
+    <w:lvl w:ilvl="5" w:tplc="04090005" w:tentative="1">
+      <w:start w:val="1"/>
+      <w:numFmt w:val="bullet"/>
+      <w:lvlText w:val=""/>
+      <w:lvlJc w:val="left"/>
+      <w:pPr>
+        <w:ind w:left="4320" w:hanging="360"/>
+      </w:pPr>
+      <w:rPr>
+        <w:rFonts w:ascii="Wingdings" w:hAnsi="Wingdings" w:hint="default"/>
+      </w:rPr>
+    </w:lvl>
+    <w:lvl w:ilvl="6" w:tplc="04090001" w:tentative="1">
+      <w:start w:val="1"/>
+      <w:numFmt w:val="bullet"/>
+      <w:lvlText w:val=""/>
+      <w:lvlJc w:val="left"/>
+      <w:pPr>
+        <w:ind w:left="5040" w:hanging="360"/>
+      </w:pPr>
+      <w:rPr>
+        <w:rFonts w:ascii="Symbol" w:hAnsi="Symbol" w:hint="default"/>
+      </w:rPr>
+    </w:lvl>
+    <w:lvl w:ilvl="7" w:tplc="04090003" w:tentative="1">
+      <w:start w:val="1"/>
+      <w:numFmt w:val="bullet"/>
+      <w:lvlText w:val="o"/>
+      <w:lvlJc w:val="left"/>
+      <w:pPr>
+        <w:ind w:left="5760" w:hanging="360"/>
+      </w:pPr>
+      <w:rPr>
+        <w:rFonts w:ascii="Courier New" w:hAnsi="Courier New" w:cs="Courier New" w:hint="default"/>
+      </w:rPr>
+    </w:lvl>
+    <w:lvl w:ilvl="8" w:tplc="04090005" w:tentative="1">
+      <w:start w:val="1"/>
+      <w:numFmt w:val="bullet"/>
+      <w:lvlText w:val=""/>
+      <w:lvlJc w:val="left"/>
+      <w:pPr>
+        <w:ind w:left="6480" w:hanging="360"/>
+      </w:pPr>
+      <w:rPr>
+        <w:rFonts w:ascii="Wingdings" w:hAnsi="Wingdings" w:hint="default"/>
+      </w:rPr>
+    </w:lvl>
+  </w:abstractNum>
+  <w:abstractNum w:abstractNumId="10" w15:restartNumberingAfterBreak="0">
+    <w:nsid w:val="4AD10AD4"/>
+    <w:multiLevelType w:val="hybridMultilevel"/>
+    <w:tmpl w:val="55AC3B88"/>
+    <w:lvl w:ilvl="0" w:tplc="0409000F">
+      <w:start w:val="1"/>
+      <w:numFmt w:val="decimal"/>
+      <w:lvlText w:val="%1."/>
+      <w:lvlJc w:val="left"/>
+      <w:pPr>
+        <w:ind w:left="720" w:hanging="360"/>
+      </w:pPr>
+      <w:rPr>
+        <w:rFonts w:hint="default"/>
+      </w:rPr>
+    </w:lvl>
+    <w:lvl w:ilvl="1" w:tplc="FFFFFFFF" w:tentative="1">
+      <w:start w:val="1"/>
+      <w:numFmt w:val="bullet"/>
+      <w:lvlText w:val="o"/>
+      <w:lvlJc w:val="left"/>
+      <w:pPr>
+        <w:ind w:left="1440" w:hanging="360"/>
+      </w:pPr>
+      <w:rPr>
+        <w:rFonts w:ascii="Courier New" w:hAnsi="Courier New" w:cs="Courier New" w:hint="default"/>
+      </w:rPr>
+    </w:lvl>
+    <w:lvl w:ilvl="2" w:tplc="FFFFFFFF" w:tentative="1">
+      <w:start w:val="1"/>
+      <w:numFmt w:val="bullet"/>
+      <w:lvlText w:val=""/>
+      <w:lvlJc w:val="left"/>
+      <w:pPr>
+        <w:ind w:left="2160" w:hanging="360"/>
+      </w:pPr>
+      <w:rPr>
+        <w:rFonts w:ascii="Wingdings" w:hAnsi="Wingdings" w:hint="default"/>
+      </w:rPr>
+    </w:lvl>
+    <w:lvl w:ilvl="3" w:tplc="FFFFFFFF" w:tentative="1">
+      <w:start w:val="1"/>
+      <w:numFmt w:val="bullet"/>
+      <w:lvlText w:val=""/>
+      <w:lvlJc w:val="left"/>
+      <w:pPr>
+        <w:ind w:left="2880" w:hanging="360"/>
+      </w:pPr>
+      <w:rPr>
+        <w:rFonts w:ascii="Symbol" w:hAnsi="Symbol" w:hint="default"/>
+      </w:rPr>
+    </w:lvl>
+    <w:lvl w:ilvl="4" w:tplc="FFFFFFFF" w:tentative="1">
+      <w:start w:val="1"/>
+      <w:numFmt w:val="bullet"/>
+      <w:lvlText w:val="o"/>
+      <w:lvlJc w:val="left"/>
+      <w:pPr>
+        <w:ind w:left="3600" w:hanging="360"/>
+      </w:pPr>
+      <w:rPr>
+        <w:rFonts w:ascii="Courier New" w:hAnsi="Courier New" w:cs="Courier New" w:hint="default"/>
+      </w:rPr>
+    </w:lvl>
+    <w:lvl w:ilvl="5" w:tplc="FFFFFFFF" w:tentative="1">
+      <w:start w:val="1"/>
+      <w:numFmt w:val="bullet"/>
+      <w:lvlText w:val=""/>
+      <w:lvlJc w:val="left"/>
+      <w:pPr>
+        <w:ind w:left="4320" w:hanging="360"/>
+      </w:pPr>
+      <w:rPr>
+        <w:rFonts w:ascii="Wingdings" w:hAnsi="Wingdings" w:hint="default"/>
+      </w:rPr>
+    </w:lvl>
+    <w:lvl w:ilvl="6" w:tplc="FFFFFFFF" w:tentative="1">
+      <w:start w:val="1"/>
+      <w:numFmt w:val="bullet"/>
+      <w:lvlText w:val=""/>
+      <w:lvlJc w:val="left"/>
+      <w:pPr>
+        <w:ind w:left="5040" w:hanging="360"/>
+      </w:pPr>
+      <w:rPr>
+        <w:rFonts w:ascii="Symbol" w:hAnsi="Symbol" w:hint="default"/>
+      </w:rPr>
+    </w:lvl>
+    <w:lvl w:ilvl="7" w:tplc="FFFFFFFF" w:tentative="1">
+      <w:start w:val="1"/>
+      <w:numFmt w:val="bullet"/>
+      <w:lvlText w:val="o"/>
+      <w:lvlJc w:val="left"/>
+      <w:pPr>
+        <w:ind w:left="5760" w:hanging="360"/>
+      </w:pPr>
+      <w:rPr>
+        <w:rFonts w:ascii="Courier New" w:hAnsi="Courier New" w:cs="Courier New" w:hint="default"/>
+      </w:rPr>
+    </w:lvl>
+    <w:lvl w:ilvl="8" w:tplc="FFFFFFFF" w:tentative="1">
+      <w:start w:val="1"/>
+      <w:numFmt w:val="bullet"/>
+      <w:lvlText w:val=""/>
+      <w:lvlJc w:val="left"/>
+      <w:pPr>
+        <w:ind w:left="6480" w:hanging="360"/>
+      </w:pPr>
+      <w:rPr>
+        <w:rFonts w:ascii="Wingdings" w:hAnsi="Wingdings" w:hint="default"/>
+      </w:rPr>
+    </w:lvl>
+  </w:abstractNum>
+  <w:abstractNum w:abstractNumId="11" w15:restartNumberingAfterBreak="0">
+    <w:nsid w:val="60A01D9F"/>
+    <w:multiLevelType w:val="hybridMultilevel"/>
+    <w:tmpl w:val="740ED826"/>
+    <w:lvl w:ilvl="0" w:tplc="1E40F8B8">
+      <w:start w:val="3"/>
+      <w:numFmt w:val="bullet"/>
+      <w:lvlText w:val="-"/>
+      <w:lvlJc w:val="left"/>
+      <w:pPr>
+        <w:ind w:left="720" w:hanging="360"/>
+      </w:pPr>
+      <w:rPr>
+        <w:rFonts w:ascii="Cambria" w:eastAsiaTheme="minorEastAsia" w:hAnsi="Cambria" w:cstheme="minorBidi" w:hint="default"/>
+      </w:rPr>
+    </w:lvl>
+    <w:lvl w:ilvl="1" w:tplc="04090003" w:tentative="1">
+      <w:start w:val="1"/>
+      <w:numFmt w:val="bullet"/>
+      <w:lvlText w:val="o"/>
+      <w:lvlJc w:val="left"/>
+      <w:pPr>
+        <w:ind w:left="1440" w:hanging="360"/>
+      </w:pPr>
+      <w:rPr>
+        <w:rFonts w:ascii="Courier New" w:hAnsi="Courier New" w:cs="Courier New" w:hint="default"/>
+      </w:rPr>
+    </w:lvl>
+    <w:lvl w:ilvl="2" w:tplc="04090005" w:tentative="1">
+      <w:start w:val="1"/>
+      <w:numFmt w:val="bullet"/>
+      <w:lvlText w:val=""/>
+      <w:lvlJc w:val="left"/>
+      <w:pPr>
+        <w:ind w:left="2160" w:hanging="360"/>
+      </w:pPr>
+      <w:rPr>
+        <w:rFonts w:ascii="Wingdings" w:hAnsi="Wingdings" w:hint="default"/>
+      </w:rPr>
+    </w:lvl>
+    <w:lvl w:ilvl="3" w:tplc="04090001" w:tentative="1">
+      <w:start w:val="1"/>
+      <w:numFmt w:val="bullet"/>
+      <w:lvlText w:val=""/>
+      <w:lvlJc w:val="left"/>
+      <w:pPr>
+        <w:ind w:left="2880" w:hanging="360"/>
+      </w:pPr>
+      <w:rPr>
+        <w:rFonts w:ascii="Symbol" w:hAnsi="Symbol" w:hint="default"/>
+      </w:rPr>
+    </w:lvl>
+    <w:lvl w:ilvl="4" w:tplc="04090003" w:tentative="1">
+      <w:start w:val="1"/>
+      <w:numFmt w:val="bullet"/>
+      <w:lvlText w:val="o"/>
+      <w:lvlJc w:val="left"/>
+      <w:pPr>
+        <w:ind w:left="3600" w:hanging="360"/>
+      </w:pPr>
+      <w:rPr>
+        <w:rFonts w:ascii="Courier New" w:hAnsi="Courier New" w:cs="Courier New" w:hint="default"/>
+      </w:rPr>
+    </w:lvl>
+    <w:lvl w:ilvl="5" w:tplc="04090005" w:tentative="1">
+      <w:start w:val="1"/>
+      <w:numFmt w:val="bullet"/>
+      <w:lvlText w:val=""/>
+      <w:lvlJc w:val="left"/>
+      <w:pPr>
+        <w:ind w:left="4320" w:hanging="360"/>
+      </w:pPr>
+      <w:rPr>
+        <w:rFonts w:ascii="Wingdings" w:hAnsi="Wingdings" w:hint="default"/>
+      </w:rPr>
+    </w:lvl>
+    <w:lvl w:ilvl="6" w:tplc="04090001" w:tentative="1">
+      <w:start w:val="1"/>
+      <w:numFmt w:val="bullet"/>
+      <w:lvlText w:val=""/>
+      <w:lvlJc w:val="left"/>
+      <w:pPr>
+        <w:ind w:left="5040" w:hanging="360"/>
+      </w:pPr>
+      <w:rPr>
+        <w:rFonts w:ascii="Symbol" w:hAnsi="Symbol" w:hint="default"/>
+      </w:rPr>
+    </w:lvl>
+    <w:lvl w:ilvl="7" w:tplc="04090003" w:tentative="1">
+      <w:start w:val="1"/>
+      <w:numFmt w:val="bullet"/>
+      <w:lvlText w:val="o"/>
+      <w:lvlJc w:val="left"/>
+      <w:pPr>
+        <w:ind w:left="5760" w:hanging="360"/>
+      </w:pPr>
+      <w:rPr>
+        <w:rFonts w:ascii="Courier New" w:hAnsi="Courier New" w:cs="Courier New" w:hint="default"/>
+      </w:rPr>
+    </w:lvl>
+    <w:lvl w:ilvl="8" w:tplc="04090005" w:tentative="1">
+      <w:start w:val="1"/>
+      <w:numFmt w:val="bullet"/>
+      <w:lvlText w:val=""/>
+      <w:lvlJc w:val="left"/>
+      <w:pPr>
+        <w:ind w:left="6480" w:hanging="360"/>
+      </w:pPr>
+      <w:rPr>
+        <w:rFonts w:ascii="Wingdings" w:hAnsi="Wingdings" w:hint="default"/>
+      </w:rPr>
+    </w:lvl>
+  </w:abstractNum>
+  <w:abstractNum w:abstractNumId="12" w15:restartNumberingAfterBreak="0">
+    <w:nsid w:val="744954D4"/>
+    <w:multiLevelType w:val="hybridMultilevel"/>
+    <w:tmpl w:val="25F80C70"/>
+    <w:lvl w:ilvl="0" w:tplc="04090001">
+      <w:start w:val="1"/>
+      <w:numFmt w:val="bullet"/>
+      <w:lvlText w:val=""/>
+      <w:lvlJc w:val="left"/>
+      <w:pPr>
+        <w:ind w:left="720" w:hanging="360"/>
+      </w:pPr>
+      <w:rPr>
+        <w:rFonts w:ascii="Symbol" w:hAnsi="Symbol" w:hint="default"/>
+      </w:rPr>
+    </w:lvl>
+    <w:lvl w:ilvl="1" w:tplc="FFFFFFFF" w:tentative="1">
+      <w:start w:val="1"/>
+      <w:numFmt w:val="bullet"/>
+      <w:lvlText w:val="o"/>
+      <w:lvlJc w:val="left"/>
+      <w:pPr>
+        <w:ind w:left="1440" w:hanging="360"/>
+      </w:pPr>
+      <w:rPr>
+        <w:rFonts w:ascii="Courier New" w:hAnsi="Courier New" w:cs="Courier New" w:hint="default"/>
+      </w:rPr>
+    </w:lvl>
+    <w:lvl w:ilvl="2" w:tplc="FFFFFFFF" w:tentative="1">
+      <w:start w:val="1"/>
+      <w:numFmt w:val="bullet"/>
+      <w:lvlText w:val=""/>
+      <w:lvlJc w:val="left"/>
+      <w:pPr>
+        <w:ind w:left="2160" w:hanging="360"/>
+      </w:pPr>
+      <w:rPr>
+        <w:rFonts w:ascii="Wingdings" w:hAnsi="Wingdings" w:hint="default"/>
+      </w:rPr>
+    </w:lvl>
+    <w:lvl w:ilvl="3" w:tplc="FFFFFFFF" w:tentative="1">
+      <w:start w:val="1"/>
+      <w:numFmt w:val="bullet"/>
+      <w:lvlText w:val=""/>
+      <w:lvlJc w:val="left"/>
+      <w:pPr>
+        <w:ind w:left="2880" w:hanging="360"/>
+      </w:pPr>
+      <w:rPr>
+        <w:rFonts w:ascii="Symbol" w:hAnsi="Symbol" w:hint="default"/>
+      </w:rPr>
+    </w:lvl>
+    <w:lvl w:ilvl="4" w:tplc="FFFFFFFF" w:tentative="1">
+      <w:start w:val="1"/>
+      <w:numFmt w:val="bullet"/>
+      <w:lvlText w:val="o"/>
+      <w:lvlJc w:val="left"/>
+      <w:pPr>
+        <w:ind w:left="3600" w:hanging="360"/>
+      </w:pPr>
+      <w:rPr>
+        <w:rFonts w:ascii="Courier New" w:hAnsi="Courier New" w:cs="Courier New" w:hint="default"/>
+      </w:rPr>
+    </w:lvl>
+    <w:lvl w:ilvl="5" w:tplc="FFFFFFFF" w:tentative="1">
+      <w:start w:val="1"/>
+      <w:numFmt w:val="bullet"/>
+      <w:lvlText w:val=""/>
+      <w:lvlJc w:val="left"/>
+      <w:pPr>
+        <w:ind w:left="4320" w:hanging="360"/>
+      </w:pPr>
+      <w:rPr>
+        <w:rFonts w:ascii="Wingdings" w:hAnsi="Wingdings" w:hint="default"/>
+      </w:rPr>
+    </w:lvl>
+    <w:lvl w:ilvl="6" w:tplc="FFFFFFFF" w:tentative="1">
+      <w:start w:val="1"/>
+      <w:numFmt w:val="bullet"/>
+      <w:lvlText w:val=""/>
+      <w:lvlJc w:val="left"/>
+      <w:pPr>
+        <w:ind w:left="5040" w:hanging="360"/>
+      </w:pPr>
+      <w:rPr>
+        <w:rFonts w:ascii="Symbol" w:hAnsi="Symbol" w:hint="default"/>
+      </w:rPr>
+    </w:lvl>
+    <w:lvl w:ilvl="7" w:tplc="FFFFFFFF" w:tentative="1">
+      <w:start w:val="1"/>
+      <w:numFmt w:val="bullet"/>
+      <w:lvlText w:val="o"/>
+      <w:lvlJc w:val="left"/>
+      <w:pPr>
+        <w:ind w:left="5760" w:hanging="360"/>
+      </w:pPr>
+      <w:rPr>
+        <w:rFonts w:ascii="Courier New" w:hAnsi="Courier New" w:cs="Courier New" w:hint="default"/>
+      </w:rPr>
+    </w:lvl>
+    <w:lvl w:ilvl="8" w:tplc="FFFFFFFF" w:tentative="1">
+      <w:start w:val="1"/>
+      <w:numFmt w:val="bullet"/>
+      <w:lvlText w:val=""/>
+      <w:lvlJc w:val="left"/>
+      <w:pPr>
+        <w:ind w:left="6480" w:hanging="360"/>
+      </w:pPr>
+      <w:rPr>
+        <w:rFonts w:ascii="Wingdings" w:hAnsi="Wingdings" w:hint="default"/>
+      </w:rPr>
+    </w:lvl>
+  </w:abstractNum>
+  <w:abstractNum w:abstractNumId="13" w15:restartNumberingAfterBreak="0">
+    <w:nsid w:val="781C0A24"/>
+    <w:multiLevelType w:val="hybridMultilevel"/>
+    <w:tmpl w:val="ABD6BE14"/>
+    <w:lvl w:ilvl="0" w:tplc="1E40F8B8">
+      <w:start w:val="3"/>
+      <w:numFmt w:val="bullet"/>
+      <w:lvlText w:val="-"/>
+      <w:lvlJc w:val="left"/>
+      <w:pPr>
+        <w:ind w:left="720" w:hanging="360"/>
+      </w:pPr>
+      <w:rPr>
+        <w:rFonts w:ascii="Cambria" w:eastAsiaTheme="minorEastAsia" w:hAnsi="Cambria" w:cstheme="minorBidi" w:hint="default"/>
+      </w:rPr>
+    </w:lvl>
+    <w:lvl w:ilvl="1" w:tplc="FFFFFFFF" w:tentative="1">
+      <w:start w:val="1"/>
+      <w:numFmt w:val="bullet"/>
+      <w:lvlText w:val="o"/>
+      <w:lvlJc w:val="left"/>
+      <w:pPr>
+        <w:ind w:left="1440" w:hanging="360"/>
+      </w:pPr>
+      <w:rPr>
+        <w:rFonts w:ascii="Courier New" w:hAnsi="Courier New" w:cs="Courier New" w:hint="default"/>
+      </w:rPr>
+    </w:lvl>
+    <w:lvl w:ilvl="2" w:tplc="FFFFFFFF" w:tentative="1">
+      <w:start w:val="1"/>
+      <w:numFmt w:val="bullet"/>
+      <w:lvlText w:val=""/>
+      <w:lvlJc w:val="left"/>
+      <w:pPr>
+        <w:ind w:left="2160" w:hanging="360"/>
+      </w:pPr>
+      <w:rPr>
+        <w:rFonts w:ascii="Wingdings" w:hAnsi="Wingdings" w:hint="default"/>
+      </w:rPr>
+    </w:lvl>
+    <w:lvl w:ilvl="3" w:tplc="FFFFFFFF" w:tentative="1">
+      <w:start w:val="1"/>
+      <w:numFmt w:val="bullet"/>
+      <w:lvlText w:val=""/>
+      <w:lvlJc w:val="left"/>
+      <w:pPr>
+        <w:ind w:left="2880" w:hanging="360"/>
+      </w:pPr>
+      <w:rPr>
+        <w:rFonts w:ascii="Symbol" w:hAnsi="Symbol" w:hint="default"/>
+      </w:rPr>
+    </w:lvl>
+    <w:lvl w:ilvl="4" w:tplc="FFFFFFFF" w:tentative="1">
+      <w:start w:val="1"/>
+      <w:numFmt w:val="bullet"/>
+      <w:lvlText w:val="o"/>
+      <w:lvlJc w:val="left"/>
+      <w:pPr>
+        <w:ind w:left="3600" w:hanging="360"/>
+      </w:pPr>
+      <w:rPr>
+        <w:rFonts w:ascii="Courier New" w:hAnsi="Courier New" w:cs="Courier New" w:hint="default"/>
+      </w:rPr>
+    </w:lvl>
+    <w:lvl w:ilvl="5" w:tplc="FFFFFFFF" w:tentative="1">
+      <w:start w:val="1"/>
+      <w:numFmt w:val="bullet"/>
+      <w:lvlText w:val=""/>
+      <w:lvlJc w:val="left"/>
+      <w:pPr>
+        <w:ind w:left="4320" w:hanging="360"/>
+      </w:pPr>
+      <w:rPr>
+        <w:rFonts w:ascii="Wingdings" w:hAnsi="Wingdings" w:hint="default"/>
+      </w:rPr>
+    </w:lvl>
+    <w:lvl w:ilvl="6" w:tplc="FFFFFFFF" w:tentative="1">
+      <w:start w:val="1"/>
+      <w:numFmt w:val="bullet"/>
+      <w:lvlText w:val=""/>
+      <w:lvlJc w:val="left"/>
+      <w:pPr>
+        <w:ind w:left="5040" w:hanging="360"/>
+      </w:pPr>
+      <w:rPr>
+        <w:rFonts w:ascii="Symbol" w:hAnsi="Symbol" w:hint="default"/>
+      </w:rPr>
+    </w:lvl>
+    <w:lvl w:ilvl="7" w:tplc="FFFFFFFF" w:tentative="1">
+      <w:start w:val="1"/>
+      <w:numFmt w:val="bullet"/>
+      <w:lvlText w:val="o"/>
+      <w:lvlJc w:val="left"/>
+      <w:pPr>
+        <w:ind w:left="5760" w:hanging="360"/>
+      </w:pPr>
+      <w:rPr>
+        <w:rFonts w:ascii="Courier New" w:hAnsi="Courier New" w:cs="Courier New" w:hint="default"/>
+      </w:rPr>
+    </w:lvl>
+    <w:lvl w:ilvl="8" w:tplc="FFFFFFFF" w:tentative="1">
+      <w:start w:val="1"/>
+      <w:numFmt w:val="bullet"/>
+      <w:lvlText w:val=""/>
+      <w:lvlJc w:val="left"/>
+      <w:pPr>
+        <w:ind w:left="6480" w:hanging="360"/>
+      </w:pPr>
+      <w:rPr>
+        <w:rFonts w:ascii="Wingdings" w:hAnsi="Wingdings" w:hint="default"/>
       </w:rPr>
     </w:lvl>
   </w:abstractNum>
@@ -1286,6 +3834,21 @@
   </w:num>
   <w:num w:numId="9" w16cid:durableId="97064064">
     <w:abstractNumId w:val="0"/>
+  </w:num>
+  <w:num w:numId="10" w16cid:durableId="221718236">
+    <w:abstractNumId w:val="11"/>
+  </w:num>
+  <w:num w:numId="11" w16cid:durableId="307705366">
+    <w:abstractNumId w:val="9"/>
+  </w:num>
+  <w:num w:numId="12" w16cid:durableId="647443917">
+    <w:abstractNumId w:val="10"/>
+  </w:num>
+  <w:num w:numId="13" w16cid:durableId="2139450862">
+    <w:abstractNumId w:val="12"/>
+  </w:num>
+  <w:num w:numId="14" w16cid:durableId="749231191">
+    <w:abstractNumId w:val="13"/>
   </w:num>
 </w:numbering>
 </file>
@@ -1893,7 +4456,6 @@
   <w:style w:type="character" w:default="1" w:styleId="DefaultParagraphFont">
     <w:name w:val="Default Paragraph Font"/>
     <w:uiPriority w:val="1"/>
-    <w:semiHidden/>
     <w:unhideWhenUsed/>
   </w:style>
   <w:style w:type="table" w:default="1" w:styleId="TableNormal">
@@ -12669,6 +15231,29 @@
         <w:shd w:val="clear" w:color="auto" w:fill="FBCAA2" w:themeFill="accent6" w:themeFillTint="7F"/>
       </w:tcPr>
     </w:tblStylePr>
+  </w:style>
+  <w:style w:type="character" w:styleId="Hyperlink">
+    <w:name w:val="Hyperlink"/>
+    <w:basedOn w:val="DefaultParagraphFont"/>
+    <w:uiPriority w:val="99"/>
+    <w:unhideWhenUsed/>
+    <w:rsid w:val="00770875"/>
+    <w:rPr>
+      <w:color w:val="0000FF" w:themeColor="hyperlink"/>
+      <w:u w:val="single"/>
+    </w:rPr>
+  </w:style>
+  <w:style w:type="character" w:styleId="UnresolvedMention">
+    <w:name w:val="Unresolved Mention"/>
+    <w:basedOn w:val="DefaultParagraphFont"/>
+    <w:uiPriority w:val="99"/>
+    <w:semiHidden/>
+    <w:unhideWhenUsed/>
+    <w:rsid w:val="00770875"/>
+    <w:rPr>
+      <w:color w:val="605E5C"/>
+      <w:shd w:val="clear" w:color="auto" w:fill="E1DFDD"/>
+    </w:rPr>
   </w:style>
 </w:styles>
 </file>

</xml_diff>